<commit_message>
Completed Firebase analytics and reorganized docs
</commit_message>
<xml_diff>
--- a/flutter_web/fw10_firebase_web_hosting.docx
+++ b/flutter_web/fw10_firebase_web_hosting.docx
@@ -183,7 +183,23 @@
           <w:sz w:val="32"/>
           <w:szCs w:val="32"/>
         </w:rPr>
-        <w:t>………………………..13</w:t>
+        <w:t>……………………</w:t>
+      </w:r>
+      <w:proofErr w:type="gramStart"/>
+      <w:r>
+        <w:rPr>
+          <w:sz w:val="32"/>
+          <w:szCs w:val="32"/>
+        </w:rPr>
+        <w:t>…..</w:t>
+      </w:r>
+      <w:proofErr w:type="gramEnd"/>
+      <w:r>
+        <w:rPr>
+          <w:sz w:val="32"/>
+          <w:szCs w:val="32"/>
+        </w:rPr>
+        <w:t>13</w:t>
       </w:r>
     </w:p>
     <w:p>
@@ -266,7 +282,39 @@
           <w:sz w:val="32"/>
           <w:szCs w:val="32"/>
         </w:rPr>
-        <w:t xml:space="preserve"> Analytics for Flutter Web…………………………………..15</w:t>
+        <w:t xml:space="preserve"> Analytics for </w:t>
+      </w:r>
+      <w:r>
+        <w:rPr>
+          <w:b/>
+          <w:bCs/>
+          <w:sz w:val="32"/>
+          <w:szCs w:val="32"/>
+        </w:rPr>
+        <w:t>Flutter</w:t>
+      </w:r>
+      <w:r>
+        <w:rPr>
+          <w:sz w:val="32"/>
+          <w:szCs w:val="32"/>
+        </w:rPr>
+        <w:t xml:space="preserve"> Web………………………………</w:t>
+      </w:r>
+      <w:proofErr w:type="gramStart"/>
+      <w:r>
+        <w:rPr>
+          <w:sz w:val="32"/>
+          <w:szCs w:val="32"/>
+        </w:rPr>
+        <w:t>…..</w:t>
+      </w:r>
+      <w:proofErr w:type="gramEnd"/>
+      <w:r>
+        <w:rPr>
+          <w:sz w:val="32"/>
+          <w:szCs w:val="32"/>
+        </w:rPr>
+        <w:t>15</w:t>
       </w:r>
     </w:p>
     <w:p>
@@ -417,15 +465,27 @@
           <w:szCs w:val="32"/>
         </w:rPr>
       </w:pPr>
-      <w:r>
-        <w:rPr>
-          <w:b/>
-          <w:bCs/>
-          <w:color w:val="D86DCB" w:themeColor="accent5" w:themeTint="99"/>
-          <w:sz w:val="32"/>
-          <w:szCs w:val="32"/>
-        </w:rPr>
-        <w:t>Firebase.initializeApp()</w:t>
+      <w:proofErr w:type="spellStart"/>
+      <w:r>
+        <w:rPr>
+          <w:b/>
+          <w:bCs/>
+          <w:color w:val="D86DCB" w:themeColor="accent5" w:themeTint="99"/>
+          <w:sz w:val="32"/>
+          <w:szCs w:val="32"/>
+        </w:rPr>
+        <w:t>Firebase.initializeApp</w:t>
+      </w:r>
+      <w:proofErr w:type="spellEnd"/>
+      <w:r>
+        <w:rPr>
+          <w:b/>
+          <w:bCs/>
+          <w:color w:val="D86DCB" w:themeColor="accent5" w:themeTint="99"/>
+          <w:sz w:val="32"/>
+          <w:szCs w:val="32"/>
+        </w:rPr>
+        <w:t>()</w:t>
       </w:r>
     </w:p>
     <w:p>
@@ -443,6 +503,8 @@
         </w:rPr>
         <w:t xml:space="preserve"># In </w:t>
       </w:r>
+      <w:proofErr w:type="spellStart"/>
+      <w:proofErr w:type="gramStart"/>
       <w:r>
         <w:rPr>
           <w:b/>
@@ -452,6 +514,8 @@
         </w:rPr>
         <w:t>main.dart</w:t>
       </w:r>
+      <w:proofErr w:type="spellEnd"/>
+      <w:proofErr w:type="gramEnd"/>
       <w:r>
         <w:rPr>
           <w:sz w:val="32"/>
@@ -600,6 +664,7 @@
           <w:szCs w:val="32"/>
         </w:rPr>
       </w:pPr>
+      <w:proofErr w:type="spellStart"/>
       <w:r>
         <w:rPr>
           <w:b/>
@@ -609,6 +674,7 @@
         </w:rPr>
         <w:t>Firestore</w:t>
       </w:r>
+      <w:proofErr w:type="spellEnd"/>
     </w:p>
     <w:p>
       <w:pPr>
@@ -1037,6 +1103,7 @@
         </w:rPr>
         <w:t xml:space="preserve"> (</w:t>
       </w:r>
+      <w:proofErr w:type="spellStart"/>
       <w:r>
         <w:rPr>
           <w:b/>
@@ -1046,6 +1113,7 @@
         </w:rPr>
         <w:t>npm</w:t>
       </w:r>
+      <w:proofErr w:type="spellEnd"/>
       <w:r>
         <w:rPr>
           <w:sz w:val="32"/>
@@ -1053,6 +1121,7 @@
         </w:rPr>
         <w:t xml:space="preserve">) is downloaded and updated first. Then Run this command in the terminal of the </w:t>
       </w:r>
+      <w:proofErr w:type="spellStart"/>
       <w:r>
         <w:rPr>
           <w:b/>
@@ -1062,6 +1131,7 @@
         </w:rPr>
         <w:t>project_root</w:t>
       </w:r>
+      <w:proofErr w:type="spellEnd"/>
       <w:r>
         <w:rPr>
           <w:sz w:val="32"/>
@@ -1097,6 +1167,7 @@
           <w:szCs w:val="32"/>
         </w:rPr>
       </w:pPr>
+      <w:proofErr w:type="spellStart"/>
       <w:r>
         <w:rPr>
           <w:b/>
@@ -1105,7 +1176,18 @@
           <w:sz w:val="32"/>
           <w:szCs w:val="32"/>
         </w:rPr>
-        <w:t>npm install -g firebase-tools</w:t>
+        <w:t>npm</w:t>
+      </w:r>
+      <w:proofErr w:type="spellEnd"/>
+      <w:r>
+        <w:rPr>
+          <w:b/>
+          <w:bCs/>
+          <w:color w:val="60CAF3" w:themeColor="accent4" w:themeTint="99"/>
+          <w:sz w:val="32"/>
+          <w:szCs w:val="32"/>
+        </w:rPr>
+        <w:t xml:space="preserve"> install -g firebase-tools</w:t>
       </w:r>
     </w:p>
     <w:p>
@@ -1130,12 +1212,21 @@
         </w:rPr>
         <w:t xml:space="preserve">Optional, </w:t>
       </w:r>
-      <w:r>
-        <w:rPr>
-          <w:sz w:val="32"/>
-          <w:szCs w:val="32"/>
-        </w:rPr>
-        <w:t xml:space="preserve">Or we can install the </w:t>
+      <w:proofErr w:type="gramStart"/>
+      <w:r>
+        <w:rPr>
+          <w:sz w:val="32"/>
+          <w:szCs w:val="32"/>
+        </w:rPr>
+        <w:t>Or</w:t>
+      </w:r>
+      <w:proofErr w:type="gramEnd"/>
+      <w:r>
+        <w:rPr>
+          <w:sz w:val="32"/>
+          <w:szCs w:val="32"/>
+        </w:rPr>
+        <w:t xml:space="preserve"> we can install the </w:t>
       </w:r>
       <w:r>
         <w:rPr>
@@ -1160,6 +1251,7 @@
         </w:rPr>
         <w:t xml:space="preserve"> which means </w:t>
       </w:r>
+      <w:proofErr w:type="spellStart"/>
       <w:r>
         <w:rPr>
           <w:b/>
@@ -1169,6 +1261,7 @@
         </w:rPr>
         <w:t>npm</w:t>
       </w:r>
+      <w:proofErr w:type="spellEnd"/>
       <w:r>
         <w:rPr>
           <w:sz w:val="32"/>
@@ -1192,6 +1285,7 @@
         </w:rPr>
         <w:t xml:space="preserve"> CLI in the </w:t>
       </w:r>
+      <w:proofErr w:type="spellStart"/>
       <w:r>
         <w:rPr>
           <w:b/>
@@ -1201,6 +1295,7 @@
         </w:rPr>
         <w:t>node_modules</w:t>
       </w:r>
+      <w:proofErr w:type="spellEnd"/>
       <w:r>
         <w:rPr>
           <w:sz w:val="32"/>
@@ -1208,6 +1303,7 @@
         </w:rPr>
         <w:t xml:space="preserve"> folder. Which is good for avoiding </w:t>
       </w:r>
+      <w:proofErr w:type="spellStart"/>
       <w:r>
         <w:rPr>
           <w:b/>
@@ -1217,6 +1313,7 @@
         </w:rPr>
         <w:t>sudo</w:t>
       </w:r>
+      <w:proofErr w:type="spellEnd"/>
       <w:r>
         <w:rPr>
           <w:sz w:val="32"/>
@@ -1236,6 +1333,7 @@
           <w:szCs w:val="32"/>
         </w:rPr>
       </w:pPr>
+      <w:proofErr w:type="spellStart"/>
       <w:r>
         <w:rPr>
           <w:b/>
@@ -1244,7 +1342,18 @@
           <w:sz w:val="32"/>
           <w:szCs w:val="32"/>
         </w:rPr>
-        <w:t>npm install firebase-tools -D</w:t>
+        <w:t>npm</w:t>
+      </w:r>
+      <w:proofErr w:type="spellEnd"/>
+      <w:r>
+        <w:rPr>
+          <w:b/>
+          <w:bCs/>
+          <w:color w:val="60CAF3" w:themeColor="accent4" w:themeTint="99"/>
+          <w:sz w:val="32"/>
+          <w:szCs w:val="32"/>
+        </w:rPr>
+        <w:t xml:space="preserve"> install firebase-tools -D</w:t>
       </w:r>
     </w:p>
     <w:p>
@@ -1262,14 +1371,25 @@
         </w:rPr>
         <w:t xml:space="preserve"># Then we can use Firebase CLI by tapping into </w:t>
       </w:r>
-      <w:r>
-        <w:rPr>
-          <w:b/>
-          <w:bCs/>
-          <w:sz w:val="32"/>
-          <w:szCs w:val="32"/>
-        </w:rPr>
-        <w:t>node_modules/.bin/</w:t>
+      <w:proofErr w:type="spellStart"/>
+      <w:r>
+        <w:rPr>
+          <w:b/>
+          <w:bCs/>
+          <w:sz w:val="32"/>
+          <w:szCs w:val="32"/>
+        </w:rPr>
+        <w:t>node_modules</w:t>
+      </w:r>
+      <w:proofErr w:type="spellEnd"/>
+      <w:r>
+        <w:rPr>
+          <w:b/>
+          <w:bCs/>
+          <w:sz w:val="32"/>
+          <w:szCs w:val="32"/>
+        </w:rPr>
+        <w:t>/.bin/</w:t>
       </w:r>
       <w:r>
         <w:rPr>
@@ -1290,6 +1410,7 @@
           <w:szCs w:val="32"/>
         </w:rPr>
       </w:pPr>
+      <w:proofErr w:type="spellStart"/>
       <w:r>
         <w:rPr>
           <w:b/>
@@ -1298,7 +1419,18 @@
           <w:sz w:val="32"/>
           <w:szCs w:val="32"/>
         </w:rPr>
-        <w:t>node_modules/.bin/firebase --version</w:t>
+        <w:t>node_modules</w:t>
+      </w:r>
+      <w:proofErr w:type="spellEnd"/>
+      <w:r>
+        <w:rPr>
+          <w:b/>
+          <w:bCs/>
+          <w:color w:val="60CAF3" w:themeColor="accent4" w:themeTint="99"/>
+          <w:sz w:val="32"/>
+          <w:szCs w:val="32"/>
+        </w:rPr>
+        <w:t>/.bin/firebase --version</w:t>
       </w:r>
     </w:p>
     <w:p>
@@ -1422,7 +1554,31 @@
           <w:sz w:val="32"/>
           <w:szCs w:val="32"/>
         </w:rPr>
-        <w:t>firebase login:add another@gmail.com</w:t>
+        <w:t xml:space="preserve">firebase </w:t>
+      </w:r>
+      <w:proofErr w:type="spellStart"/>
+      <w:proofErr w:type="gramStart"/>
+      <w:r>
+        <w:rPr>
+          <w:b/>
+          <w:bCs/>
+          <w:color w:val="60CAF3" w:themeColor="accent4" w:themeTint="99"/>
+          <w:sz w:val="32"/>
+          <w:szCs w:val="32"/>
+        </w:rPr>
+        <w:t>login:add</w:t>
+      </w:r>
+      <w:proofErr w:type="spellEnd"/>
+      <w:proofErr w:type="gramEnd"/>
+      <w:r>
+        <w:rPr>
+          <w:b/>
+          <w:bCs/>
+          <w:color w:val="60CAF3" w:themeColor="accent4" w:themeTint="99"/>
+          <w:sz w:val="32"/>
+          <w:szCs w:val="32"/>
+        </w:rPr>
+        <w:t xml:space="preserve"> another@gmail.com</w:t>
       </w:r>
     </w:p>
     <w:p>
@@ -1460,7 +1616,31 @@
           <w:sz w:val="32"/>
           <w:szCs w:val="32"/>
         </w:rPr>
-        <w:t>firebase login:use another@gmail.com</w:t>
+        <w:t xml:space="preserve">firebase </w:t>
+      </w:r>
+      <w:proofErr w:type="spellStart"/>
+      <w:proofErr w:type="gramStart"/>
+      <w:r>
+        <w:rPr>
+          <w:b/>
+          <w:bCs/>
+          <w:color w:val="60CAF3" w:themeColor="accent4" w:themeTint="99"/>
+          <w:sz w:val="32"/>
+          <w:szCs w:val="32"/>
+        </w:rPr>
+        <w:t>login:use</w:t>
+      </w:r>
+      <w:proofErr w:type="spellEnd"/>
+      <w:proofErr w:type="gramEnd"/>
+      <w:r>
+        <w:rPr>
+          <w:b/>
+          <w:bCs/>
+          <w:color w:val="60CAF3" w:themeColor="accent4" w:themeTint="99"/>
+          <w:sz w:val="32"/>
+          <w:szCs w:val="32"/>
+        </w:rPr>
+        <w:t xml:space="preserve"> another@gmail.com</w:t>
       </w:r>
     </w:p>
     <w:p>
@@ -1523,7 +1703,29 @@
           <w:sz w:val="32"/>
           <w:szCs w:val="32"/>
         </w:rPr>
-        <w:t>firebase init hosting</w:t>
+        <w:t xml:space="preserve">firebase </w:t>
+      </w:r>
+      <w:proofErr w:type="spellStart"/>
+      <w:r>
+        <w:rPr>
+          <w:b/>
+          <w:bCs/>
+          <w:color w:val="60CAF3" w:themeColor="accent4" w:themeTint="99"/>
+          <w:sz w:val="32"/>
+          <w:szCs w:val="32"/>
+        </w:rPr>
+        <w:t>init</w:t>
+      </w:r>
+      <w:proofErr w:type="spellEnd"/>
+      <w:r>
+        <w:rPr>
+          <w:b/>
+          <w:bCs/>
+          <w:color w:val="60CAF3" w:themeColor="accent4" w:themeTint="99"/>
+          <w:sz w:val="32"/>
+          <w:szCs w:val="32"/>
+        </w:rPr>
+        <w:t xml:space="preserve"> hosting</w:t>
       </w:r>
     </w:p>
     <w:p>
@@ -2012,7 +2214,23 @@
           <w:sz w:val="32"/>
           <w:szCs w:val="32"/>
         </w:rPr>
-        <w:t xml:space="preserve"> (rewrite all urls to index.html). But if </w:t>
+        <w:t xml:space="preserve"> (rewrite all </w:t>
+      </w:r>
+      <w:proofErr w:type="spellStart"/>
+      <w:r>
+        <w:rPr>
+          <w:sz w:val="32"/>
+          <w:szCs w:val="32"/>
+        </w:rPr>
+        <w:t>urls</w:t>
+      </w:r>
+      <w:proofErr w:type="spellEnd"/>
+      <w:r>
+        <w:rPr>
+          <w:sz w:val="32"/>
+          <w:szCs w:val="32"/>
+        </w:rPr>
+        <w:t xml:space="preserve"> to index.html). But if </w:t>
       </w:r>
       <w:r>
         <w:rPr>
@@ -2177,6 +2395,7 @@
         </w:rPr>
         <w:t xml:space="preserve"> initialization will be complete and these files will be created in </w:t>
       </w:r>
+      <w:proofErr w:type="spellStart"/>
       <w:r>
         <w:rPr>
           <w:b/>
@@ -2186,6 +2405,7 @@
         </w:rPr>
         <w:t>project_root</w:t>
       </w:r>
+      <w:proofErr w:type="spellEnd"/>
       <w:r>
         <w:rPr>
           <w:sz w:val="32"/>
@@ -2209,6 +2429,8 @@
           <w:szCs w:val="32"/>
         </w:rPr>
       </w:pPr>
+      <w:proofErr w:type="spellStart"/>
+      <w:proofErr w:type="gramStart"/>
       <w:r>
         <w:rPr>
           <w:b/>
@@ -2218,6 +2440,8 @@
         </w:rPr>
         <w:t>firebase.json</w:t>
       </w:r>
+      <w:proofErr w:type="spellEnd"/>
+      <w:proofErr w:type="gramEnd"/>
     </w:p>
     <w:p>
       <w:pPr>
@@ -2234,15 +2458,28 @@
           <w:szCs w:val="32"/>
         </w:rPr>
       </w:pPr>
-      <w:r>
-        <w:rPr>
-          <w:b/>
-          <w:bCs/>
-          <w:sz w:val="32"/>
-          <w:szCs w:val="32"/>
-        </w:rPr>
-        <w:t>.firebaserc</w:t>
-      </w:r>
+      <w:proofErr w:type="gramStart"/>
+      <w:r>
+        <w:rPr>
+          <w:b/>
+          <w:bCs/>
+          <w:sz w:val="32"/>
+          <w:szCs w:val="32"/>
+        </w:rPr>
+        <w:t>.</w:t>
+      </w:r>
+      <w:proofErr w:type="spellStart"/>
+      <w:r>
+        <w:rPr>
+          <w:b/>
+          <w:bCs/>
+          <w:sz w:val="32"/>
+          <w:szCs w:val="32"/>
+        </w:rPr>
+        <w:t>firebaserc</w:t>
+      </w:r>
+      <w:proofErr w:type="spellEnd"/>
+      <w:proofErr w:type="gramEnd"/>
     </w:p>
     <w:p>
       <w:pPr>
@@ -2259,6 +2496,7 @@
           <w:szCs w:val="32"/>
         </w:rPr>
       </w:pPr>
+      <w:proofErr w:type="gramStart"/>
       <w:r>
         <w:rPr>
           <w:b/>
@@ -2268,6 +2506,7 @@
         </w:rPr>
         <w:t>.firebase</w:t>
       </w:r>
+      <w:proofErr w:type="gramEnd"/>
     </w:p>
     <w:p>
       <w:pPr>
@@ -2341,14 +2580,25 @@
         </w:rPr>
         <w:t xml:space="preserve"> will build it in the </w:t>
       </w:r>
-      <w:r>
-        <w:rPr>
-          <w:b/>
-          <w:bCs/>
-          <w:sz w:val="32"/>
-          <w:szCs w:val="32"/>
-        </w:rPr>
-        <w:t>project_root/build/web</w:t>
+      <w:proofErr w:type="spellStart"/>
+      <w:r>
+        <w:rPr>
+          <w:b/>
+          <w:bCs/>
+          <w:sz w:val="32"/>
+          <w:szCs w:val="32"/>
+        </w:rPr>
+        <w:t>project_root</w:t>
+      </w:r>
+      <w:proofErr w:type="spellEnd"/>
+      <w:r>
+        <w:rPr>
+          <w:b/>
+          <w:bCs/>
+          <w:sz w:val="32"/>
+          <w:szCs w:val="32"/>
+        </w:rPr>
+        <w:t>/build/web</w:t>
       </w:r>
       <w:r>
         <w:rPr>
@@ -2466,6 +2716,7 @@
           <w:szCs w:val="32"/>
         </w:rPr>
       </w:pPr>
+      <w:proofErr w:type="spellStart"/>
       <w:r>
         <w:rPr>
           <w:b/>
@@ -2474,7 +2725,18 @@
           <w:sz w:val="32"/>
           <w:szCs w:val="32"/>
         </w:rPr>
-        <w:t>npm run build</w:t>
+        <w:t>npm</w:t>
+      </w:r>
+      <w:proofErr w:type="spellEnd"/>
+      <w:r>
+        <w:rPr>
+          <w:b/>
+          <w:bCs/>
+          <w:color w:val="60CAF3" w:themeColor="accent4" w:themeTint="99"/>
+          <w:sz w:val="32"/>
+          <w:szCs w:val="32"/>
+        </w:rPr>
+        <w:t xml:space="preserve"> run build</w:t>
       </w:r>
     </w:p>
     <w:p>
@@ -2643,7 +2905,29 @@
           <w:sz w:val="32"/>
           <w:szCs w:val="32"/>
         </w:rPr>
-        <w:t>firebase init emulators</w:t>
+        <w:t xml:space="preserve">firebase </w:t>
+      </w:r>
+      <w:proofErr w:type="spellStart"/>
+      <w:r>
+        <w:rPr>
+          <w:b/>
+          <w:bCs/>
+          <w:color w:val="60CAF3" w:themeColor="accent4" w:themeTint="99"/>
+          <w:sz w:val="32"/>
+          <w:szCs w:val="32"/>
+        </w:rPr>
+        <w:t>init</w:t>
+      </w:r>
+      <w:proofErr w:type="spellEnd"/>
+      <w:r>
+        <w:rPr>
+          <w:b/>
+          <w:bCs/>
+          <w:color w:val="60CAF3" w:themeColor="accent4" w:themeTint="99"/>
+          <w:sz w:val="32"/>
+          <w:szCs w:val="32"/>
+        </w:rPr>
+        <w:t xml:space="preserve"> emulators</w:t>
       </w:r>
     </w:p>
     <w:p>
@@ -2739,8 +3023,22 @@
           <w:sz w:val="32"/>
           <w:szCs w:val="32"/>
         </w:rPr>
-        <w:t>firebase emulators:start</w:t>
-      </w:r>
+        <w:t xml:space="preserve">firebase </w:t>
+      </w:r>
+      <w:proofErr w:type="spellStart"/>
+      <w:proofErr w:type="gramStart"/>
+      <w:r>
+        <w:rPr>
+          <w:b/>
+          <w:bCs/>
+          <w:color w:val="60CAF3" w:themeColor="accent4" w:themeTint="99"/>
+          <w:sz w:val="32"/>
+          <w:szCs w:val="32"/>
+        </w:rPr>
+        <w:t>emulators:start</w:t>
+      </w:r>
+      <w:proofErr w:type="spellEnd"/>
+      <w:proofErr w:type="gramEnd"/>
     </w:p>
     <w:p>
       <w:pPr>
@@ -2796,14 +3094,25 @@
         </w:rPr>
         <w:t xml:space="preserve"># Now run this command in the </w:t>
       </w:r>
-      <w:r>
-        <w:rPr>
-          <w:b/>
-          <w:bCs/>
-          <w:sz w:val="32"/>
-          <w:szCs w:val="32"/>
-        </w:rPr>
-        <w:t xml:space="preserve">project_root </w:t>
+      <w:proofErr w:type="spellStart"/>
+      <w:r>
+        <w:rPr>
+          <w:b/>
+          <w:bCs/>
+          <w:sz w:val="32"/>
+          <w:szCs w:val="32"/>
+        </w:rPr>
+        <w:t>project_root</w:t>
+      </w:r>
+      <w:proofErr w:type="spellEnd"/>
+      <w:r>
+        <w:rPr>
+          <w:b/>
+          <w:bCs/>
+          <w:sz w:val="32"/>
+          <w:szCs w:val="32"/>
+        </w:rPr>
+        <w:t xml:space="preserve"> </w:t>
       </w:r>
       <w:r>
         <w:rPr>
@@ -2979,8 +3288,19 @@
           <w:sz w:val="32"/>
           <w:szCs w:val="32"/>
         </w:rPr>
-        <w:t>project-id.web.app</w:t>
-      </w:r>
+        <w:t>project-</w:t>
+      </w:r>
+      <w:proofErr w:type="spellStart"/>
+      <w:r>
+        <w:rPr>
+          <w:b/>
+          <w:bCs/>
+          <w:sz w:val="32"/>
+          <w:szCs w:val="32"/>
+        </w:rPr>
+        <w:t>id.web.app</w:t>
+      </w:r>
+      <w:proofErr w:type="spellEnd"/>
       <w:r>
         <w:rPr>
           <w:sz w:val="32"/>
@@ -3056,12 +3376,46 @@
           <w:szCs w:val="32"/>
         </w:rPr>
       </w:pPr>
-      <w:r>
-        <w:rPr>
-          <w:sz w:val="32"/>
-          <w:szCs w:val="32"/>
-        </w:rPr>
-        <w:t>.firebaserc &amp; firebase.json:</w:t>
+      <w:proofErr w:type="gramStart"/>
+      <w:r>
+        <w:rPr>
+          <w:sz w:val="32"/>
+          <w:szCs w:val="32"/>
+        </w:rPr>
+        <w:t>.</w:t>
+      </w:r>
+      <w:proofErr w:type="spellStart"/>
+      <w:r>
+        <w:rPr>
+          <w:sz w:val="32"/>
+          <w:szCs w:val="32"/>
+        </w:rPr>
+        <w:t>firebaserc</w:t>
+      </w:r>
+      <w:proofErr w:type="spellEnd"/>
+      <w:proofErr w:type="gramEnd"/>
+      <w:r>
+        <w:rPr>
+          <w:sz w:val="32"/>
+          <w:szCs w:val="32"/>
+        </w:rPr>
+        <w:t xml:space="preserve"> &amp; </w:t>
+      </w:r>
+      <w:proofErr w:type="spellStart"/>
+      <w:r>
+        <w:rPr>
+          <w:sz w:val="32"/>
+          <w:szCs w:val="32"/>
+        </w:rPr>
+        <w:t>firebase.json</w:t>
+      </w:r>
+      <w:proofErr w:type="spellEnd"/>
+      <w:r>
+        <w:rPr>
+          <w:sz w:val="32"/>
+          <w:szCs w:val="32"/>
+        </w:rPr>
+        <w:t>:</w:t>
       </w:r>
     </w:p>
     <w:p>
@@ -3088,6 +3442,7 @@
           <w:szCs w:val="32"/>
         </w:rPr>
       </w:pPr>
+      <w:proofErr w:type="gramStart"/>
       <w:r>
         <w:rPr>
           <w:sz w:val="32"/>
@@ -3102,8 +3457,20 @@
           <w:sz w:val="32"/>
           <w:szCs w:val="32"/>
         </w:rPr>
-        <w:t xml:space="preserve"> .firebaserc</w:t>
-      </w:r>
+        <w:t xml:space="preserve"> .</w:t>
+      </w:r>
+      <w:proofErr w:type="spellStart"/>
+      <w:r>
+        <w:rPr>
+          <w:b/>
+          <w:bCs/>
+          <w:sz w:val="32"/>
+          <w:szCs w:val="32"/>
+        </w:rPr>
+        <w:t>firebaserc</w:t>
+      </w:r>
+      <w:proofErr w:type="spellEnd"/>
+      <w:proofErr w:type="gramEnd"/>
       <w:r>
         <w:rPr>
           <w:sz w:val="32"/>
@@ -3159,6 +3526,8 @@
         </w:rPr>
         <w:t xml:space="preserve"># </w:t>
       </w:r>
+      <w:proofErr w:type="spellStart"/>
+      <w:proofErr w:type="gramStart"/>
       <w:r>
         <w:rPr>
           <w:b/>
@@ -3168,6 +3537,8 @@
         </w:rPr>
         <w:t>firebase.json</w:t>
       </w:r>
+      <w:proofErr w:type="spellEnd"/>
+      <w:proofErr w:type="gramEnd"/>
       <w:r>
         <w:rPr>
           <w:sz w:val="32"/>
@@ -3839,7 +4210,51 @@
           <w:sz w:val="32"/>
           <w:szCs w:val="32"/>
         </w:rPr>
-        <w:t xml:space="preserve">        "source" : "/api.json",</w:t>
+        <w:t xml:space="preserve">        "source</w:t>
+      </w:r>
+      <w:proofErr w:type="gramStart"/>
+      <w:r>
+        <w:rPr>
+          <w:b/>
+          <w:bCs/>
+          <w:color w:val="D86DCB" w:themeColor="accent5" w:themeTint="99"/>
+          <w:sz w:val="32"/>
+          <w:szCs w:val="32"/>
+        </w:rPr>
+        <w:t>" :</w:t>
+      </w:r>
+      <w:proofErr w:type="gramEnd"/>
+      <w:r>
+        <w:rPr>
+          <w:b/>
+          <w:bCs/>
+          <w:color w:val="D86DCB" w:themeColor="accent5" w:themeTint="99"/>
+          <w:sz w:val="32"/>
+          <w:szCs w:val="32"/>
+        </w:rPr>
+        <w:t xml:space="preserve"> "/</w:t>
+      </w:r>
+      <w:proofErr w:type="spellStart"/>
+      <w:r>
+        <w:rPr>
+          <w:b/>
+          <w:bCs/>
+          <w:color w:val="D86DCB" w:themeColor="accent5" w:themeTint="99"/>
+          <w:sz w:val="32"/>
+          <w:szCs w:val="32"/>
+        </w:rPr>
+        <w:t>api.json</w:t>
+      </w:r>
+      <w:proofErr w:type="spellEnd"/>
+      <w:r>
+        <w:rPr>
+          <w:b/>
+          <w:bCs/>
+          <w:color w:val="D86DCB" w:themeColor="accent5" w:themeTint="99"/>
+          <w:sz w:val="32"/>
+          <w:szCs w:val="32"/>
+        </w:rPr>
+        <w:t>",</w:t>
       </w:r>
     </w:p>
     <w:p>
@@ -4124,8 +4539,10 @@
           <w:sz w:val="32"/>
           <w:szCs w:val="32"/>
         </w:rPr>
-        <w:t>firebase hosting:channel:deploy</w:t>
-      </w:r>
+        <w:t xml:space="preserve">firebase </w:t>
+      </w:r>
+      <w:proofErr w:type="spellStart"/>
+      <w:proofErr w:type="gramStart"/>
       <w:r>
         <w:rPr>
           <w:b/>
@@ -4134,6 +4551,28 @@
           <w:sz w:val="32"/>
           <w:szCs w:val="32"/>
         </w:rPr>
+        <w:t>hosting:channel</w:t>
+      </w:r>
+      <w:proofErr w:type="gramEnd"/>
+      <w:r>
+        <w:rPr>
+          <w:b/>
+          <w:bCs/>
+          <w:color w:val="60CAF3" w:themeColor="accent4" w:themeTint="99"/>
+          <w:sz w:val="32"/>
+          <w:szCs w:val="32"/>
+        </w:rPr>
+        <w:t>:deploy</w:t>
+      </w:r>
+      <w:proofErr w:type="spellEnd"/>
+      <w:r>
+        <w:rPr>
+          <w:b/>
+          <w:bCs/>
+          <w:color w:val="60CAF3" w:themeColor="accent4" w:themeTint="99"/>
+          <w:sz w:val="32"/>
+          <w:szCs w:val="32"/>
+        </w:rPr>
         <w:t xml:space="preserve"> CHANNEL_ID</w:t>
       </w:r>
       <w:r>
@@ -4182,8 +4621,32 @@
           <w:sz w:val="32"/>
           <w:szCs w:val="32"/>
         </w:rPr>
-        <w:t>firebase hosting:channel:list</w:t>
-      </w:r>
+        <w:t xml:space="preserve">firebase </w:t>
+      </w:r>
+      <w:proofErr w:type="spellStart"/>
+      <w:proofErr w:type="gramStart"/>
+      <w:r>
+        <w:rPr>
+          <w:b/>
+          <w:bCs/>
+          <w:color w:val="60CAF3" w:themeColor="accent4" w:themeTint="99"/>
+          <w:sz w:val="32"/>
+          <w:szCs w:val="32"/>
+        </w:rPr>
+        <w:t>hosting:channel</w:t>
+      </w:r>
+      <w:proofErr w:type="gramEnd"/>
+      <w:r>
+        <w:rPr>
+          <w:b/>
+          <w:bCs/>
+          <w:color w:val="60CAF3" w:themeColor="accent4" w:themeTint="99"/>
+          <w:sz w:val="32"/>
+          <w:szCs w:val="32"/>
+        </w:rPr>
+        <w:t>:list</w:t>
+      </w:r>
+      <w:proofErr w:type="spellEnd"/>
     </w:p>
     <w:p>
       <w:pPr>
@@ -4200,6 +4663,7 @@
         </w:rPr>
         <w:t xml:space="preserve"># To delete the channel just replace the </w:t>
       </w:r>
+      <w:proofErr w:type="spellStart"/>
       <w:r>
         <w:rPr>
           <w:b/>
@@ -4218,6 +4682,7 @@
         </w:rPr>
         <w:t>hannel_ID</w:t>
       </w:r>
+      <w:proofErr w:type="spellEnd"/>
       <w:r>
         <w:rPr>
           <w:sz w:val="32"/>
@@ -4261,8 +4726,54 @@
           <w:sz w:val="32"/>
           <w:szCs w:val="32"/>
         </w:rPr>
-        <w:t>firebase hosting:channel:delete channel_ID</w:t>
-      </w:r>
+        <w:t xml:space="preserve">firebase </w:t>
+      </w:r>
+      <w:proofErr w:type="spellStart"/>
+      <w:proofErr w:type="gramStart"/>
+      <w:r>
+        <w:rPr>
+          <w:b/>
+          <w:bCs/>
+          <w:color w:val="60CAF3" w:themeColor="accent4" w:themeTint="99"/>
+          <w:sz w:val="32"/>
+          <w:szCs w:val="32"/>
+        </w:rPr>
+        <w:t>hosting:channel</w:t>
+      </w:r>
+      <w:proofErr w:type="gramEnd"/>
+      <w:r>
+        <w:rPr>
+          <w:b/>
+          <w:bCs/>
+          <w:color w:val="60CAF3" w:themeColor="accent4" w:themeTint="99"/>
+          <w:sz w:val="32"/>
+          <w:szCs w:val="32"/>
+        </w:rPr>
+        <w:t>:delete</w:t>
+      </w:r>
+      <w:proofErr w:type="spellEnd"/>
+      <w:r>
+        <w:rPr>
+          <w:b/>
+          <w:bCs/>
+          <w:color w:val="60CAF3" w:themeColor="accent4" w:themeTint="99"/>
+          <w:sz w:val="32"/>
+          <w:szCs w:val="32"/>
+        </w:rPr>
+        <w:t xml:space="preserve"> </w:t>
+      </w:r>
+      <w:proofErr w:type="spellStart"/>
+      <w:r>
+        <w:rPr>
+          <w:b/>
+          <w:bCs/>
+          <w:color w:val="60CAF3" w:themeColor="accent4" w:themeTint="99"/>
+          <w:sz w:val="32"/>
+          <w:szCs w:val="32"/>
+        </w:rPr>
+        <w:t>channel_ID</w:t>
+      </w:r>
+      <w:proofErr w:type="spellEnd"/>
     </w:p>
     <w:p>
       <w:pPr>
@@ -4402,7 +4913,23 @@
           <w:sz w:val="32"/>
           <w:szCs w:val="32"/>
         </w:rPr>
-        <w:t xml:space="preserve"> Repo and set it up with out web project using Git. Then create a new branch like </w:t>
+        <w:t xml:space="preserve"> Repo and set it up </w:t>
+      </w:r>
+      <w:proofErr w:type="spellStart"/>
+      <w:r>
+        <w:rPr>
+          <w:sz w:val="32"/>
+          <w:szCs w:val="32"/>
+        </w:rPr>
+        <w:t>with out</w:t>
+      </w:r>
+      <w:proofErr w:type="spellEnd"/>
+      <w:r>
+        <w:rPr>
+          <w:sz w:val="32"/>
+          <w:szCs w:val="32"/>
+        </w:rPr>
+        <w:t xml:space="preserve"> web project using Git. Then create a new branch like </w:t>
       </w:r>
       <w:r>
         <w:rPr>
@@ -4605,8 +5132,44 @@
           <w:sz w:val="32"/>
           <w:szCs w:val="32"/>
         </w:rPr>
-        <w:t>firebase init hosting:github</w:t>
-      </w:r>
+        <w:t xml:space="preserve">firebase </w:t>
+      </w:r>
+      <w:proofErr w:type="spellStart"/>
+      <w:r>
+        <w:rPr>
+          <w:b/>
+          <w:bCs/>
+          <w:color w:val="60CAF3" w:themeColor="accent4" w:themeTint="99"/>
+          <w:sz w:val="32"/>
+          <w:szCs w:val="32"/>
+        </w:rPr>
+        <w:t>init</w:t>
+      </w:r>
+      <w:proofErr w:type="spellEnd"/>
+      <w:r>
+        <w:rPr>
+          <w:b/>
+          <w:bCs/>
+          <w:color w:val="60CAF3" w:themeColor="accent4" w:themeTint="99"/>
+          <w:sz w:val="32"/>
+          <w:szCs w:val="32"/>
+        </w:rPr>
+        <w:t xml:space="preserve"> </w:t>
+      </w:r>
+      <w:proofErr w:type="spellStart"/>
+      <w:proofErr w:type="gramStart"/>
+      <w:r>
+        <w:rPr>
+          <w:b/>
+          <w:bCs/>
+          <w:color w:val="60CAF3" w:themeColor="accent4" w:themeTint="99"/>
+          <w:sz w:val="32"/>
+          <w:szCs w:val="32"/>
+        </w:rPr>
+        <w:t>hosting:github</w:t>
+      </w:r>
+      <w:proofErr w:type="spellEnd"/>
+      <w:proofErr w:type="gramEnd"/>
     </w:p>
     <w:p>
       <w:pPr>
@@ -4873,7 +5436,23 @@
           <w:sz w:val="32"/>
           <w:szCs w:val="32"/>
         </w:rPr>
-        <w:t xml:space="preserve"># Then its going to ask us “what script should be run before every deploy” for Flutter it will be </w:t>
+        <w:t xml:space="preserve"># Then </w:t>
+      </w:r>
+      <w:proofErr w:type="spellStart"/>
+      <w:r>
+        <w:rPr>
+          <w:sz w:val="32"/>
+          <w:szCs w:val="32"/>
+        </w:rPr>
+        <w:t>its</w:t>
+      </w:r>
+      <w:proofErr w:type="spellEnd"/>
+      <w:r>
+        <w:rPr>
+          <w:sz w:val="32"/>
+          <w:szCs w:val="32"/>
+        </w:rPr>
+        <w:t xml:space="preserve"> going to ask us “what script should be run before every deploy” for Flutter it will be </w:t>
       </w:r>
       <w:r>
         <w:rPr>
@@ -4989,6 +5568,7 @@
           <w:szCs w:val="32"/>
         </w:rPr>
       </w:pPr>
+      <w:proofErr w:type="spellStart"/>
       <w:r>
         <w:rPr>
           <w:b/>
@@ -4997,7 +5577,40 @@
           <w:sz w:val="32"/>
           <w:szCs w:val="32"/>
         </w:rPr>
-        <w:t>npm ci &amp;&amp; npm run build</w:t>
+        <w:t>npm</w:t>
+      </w:r>
+      <w:proofErr w:type="spellEnd"/>
+      <w:r>
+        <w:rPr>
+          <w:b/>
+          <w:bCs/>
+          <w:color w:val="60CAF3" w:themeColor="accent4" w:themeTint="99"/>
+          <w:sz w:val="32"/>
+          <w:szCs w:val="32"/>
+        </w:rPr>
+        <w:t xml:space="preserve"> ci &amp;&amp; </w:t>
+      </w:r>
+      <w:proofErr w:type="spellStart"/>
+      <w:r>
+        <w:rPr>
+          <w:b/>
+          <w:bCs/>
+          <w:color w:val="60CAF3" w:themeColor="accent4" w:themeTint="99"/>
+          <w:sz w:val="32"/>
+          <w:szCs w:val="32"/>
+        </w:rPr>
+        <w:t>npm</w:t>
+      </w:r>
+      <w:proofErr w:type="spellEnd"/>
+      <w:r>
+        <w:rPr>
+          <w:b/>
+          <w:bCs/>
+          <w:color w:val="60CAF3" w:themeColor="accent4" w:themeTint="99"/>
+          <w:sz w:val="32"/>
+          <w:szCs w:val="32"/>
+        </w:rPr>
+        <w:t xml:space="preserve"> run build</w:t>
       </w:r>
     </w:p>
     <w:p>
@@ -5123,7 +5736,23 @@
           <w:sz w:val="32"/>
           <w:szCs w:val="32"/>
         </w:rPr>
-        <w:t xml:space="preserve"># Then its going to ask us what Branch which is connected with our </w:t>
+        <w:t xml:space="preserve"># Then </w:t>
+      </w:r>
+      <w:proofErr w:type="spellStart"/>
+      <w:r>
+        <w:rPr>
+          <w:sz w:val="32"/>
+          <w:szCs w:val="32"/>
+        </w:rPr>
+        <w:t>its</w:t>
+      </w:r>
+      <w:proofErr w:type="spellEnd"/>
+      <w:r>
+        <w:rPr>
+          <w:sz w:val="32"/>
+          <w:szCs w:val="32"/>
+        </w:rPr>
+        <w:t xml:space="preserve"> going to ask us what Branch which is connected with our </w:t>
       </w:r>
       <w:r>
         <w:rPr>
@@ -5187,7 +5816,15 @@
           <w:sz w:val="32"/>
           <w:szCs w:val="32"/>
         </w:rPr>
-        <w:t xml:space="preserve"> CLI will generate a</w:t>
+        <w:t xml:space="preserve"> CLI will generate </w:t>
+      </w:r>
+      <w:proofErr w:type="gramStart"/>
+      <w:r>
+        <w:rPr>
+          <w:sz w:val="32"/>
+          <w:szCs w:val="32"/>
+        </w:rPr>
+        <w:t>a</w:t>
       </w:r>
       <w:r>
         <w:rPr>
@@ -5203,8 +5840,20 @@
           <w:sz w:val="32"/>
           <w:szCs w:val="32"/>
         </w:rPr>
-        <w:t>.github</w:t>
-      </w:r>
+        <w:t>.</w:t>
+      </w:r>
+      <w:proofErr w:type="spellStart"/>
+      <w:r>
+        <w:rPr>
+          <w:b/>
+          <w:bCs/>
+          <w:sz w:val="32"/>
+          <w:szCs w:val="32"/>
+        </w:rPr>
+        <w:t>github</w:t>
+      </w:r>
+      <w:proofErr w:type="spellEnd"/>
+      <w:proofErr w:type="gramEnd"/>
       <w:r>
         <w:rPr>
           <w:sz w:val="32"/>
@@ -5543,7 +6192,29 @@
           <w:szCs w:val="32"/>
         </w:rPr>
         <w:lastRenderedPageBreak/>
-        <w:t xml:space="preserve">      - uses: subosito/flutter-action@v2</w:t>
+        <w:t xml:space="preserve">      - uses: </w:t>
+      </w:r>
+      <w:proofErr w:type="spellStart"/>
+      <w:r>
+        <w:rPr>
+          <w:b/>
+          <w:bCs/>
+          <w:color w:val="D86DCB" w:themeColor="accent5" w:themeTint="99"/>
+          <w:sz w:val="32"/>
+          <w:szCs w:val="32"/>
+        </w:rPr>
+        <w:t>subosito</w:t>
+      </w:r>
+      <w:proofErr w:type="spellEnd"/>
+      <w:r>
+        <w:rPr>
+          <w:b/>
+          <w:bCs/>
+          <w:color w:val="D86DCB" w:themeColor="accent5" w:themeTint="99"/>
+          <w:sz w:val="32"/>
+          <w:szCs w:val="32"/>
+        </w:rPr>
+        <w:t>/flutter-action@v2</w:t>
       </w:r>
     </w:p>
     <w:p>
@@ -5961,6 +6632,7 @@
         </w:rPr>
         <w:t xml:space="preserve"># And updated website will be available in the </w:t>
       </w:r>
+      <w:proofErr w:type="spellStart"/>
       <w:r>
         <w:rPr>
           <w:b/>
@@ -5970,6 +6642,7 @@
         </w:rPr>
         <w:t>projet-id.web.app</w:t>
       </w:r>
+      <w:proofErr w:type="spellEnd"/>
     </w:p>
     <w:p>
       <w:pPr>
@@ -6152,7 +6825,29 @@
           <w:sz w:val="32"/>
           <w:szCs w:val="32"/>
         </w:rPr>
-        <w:t>- uses: subosito/flutter-action@v2</w:t>
+        <w:t xml:space="preserve">- uses: </w:t>
+      </w:r>
+      <w:proofErr w:type="spellStart"/>
+      <w:r>
+        <w:rPr>
+          <w:b/>
+          <w:bCs/>
+          <w:color w:val="D86DCB" w:themeColor="accent5" w:themeTint="99"/>
+          <w:sz w:val="32"/>
+          <w:szCs w:val="32"/>
+        </w:rPr>
+        <w:t>subosito</w:t>
+      </w:r>
+      <w:proofErr w:type="spellEnd"/>
+      <w:r>
+        <w:rPr>
+          <w:b/>
+          <w:bCs/>
+          <w:color w:val="D86DCB" w:themeColor="accent5" w:themeTint="99"/>
+          <w:sz w:val="32"/>
+          <w:szCs w:val="32"/>
+        </w:rPr>
+        <w:t>/flutter-action@v2</w:t>
       </w:r>
     </w:p>
     <w:p>
@@ -6240,8 +6935,20 @@
           <w:sz w:val="32"/>
           <w:szCs w:val="32"/>
         </w:rPr>
-        <w:t>- run: flutter pub get</w:t>
-      </w:r>
+        <w:t xml:space="preserve">- run: flutter pub </w:t>
+      </w:r>
+      <w:proofErr w:type="gramStart"/>
+      <w:r>
+        <w:rPr>
+          <w:b/>
+          <w:bCs/>
+          <w:color w:val="D86DCB" w:themeColor="accent5" w:themeTint="99"/>
+          <w:sz w:val="32"/>
+          <w:szCs w:val="32"/>
+        </w:rPr>
+        <w:t>get</w:t>
+      </w:r>
+      <w:proofErr w:type="gramEnd"/>
     </w:p>
     <w:p>
       <w:pPr>
@@ -6383,32 +7090,39 @@
           <w:sz w:val="32"/>
           <w:szCs w:val="32"/>
         </w:rPr>
-        <w:t>Firebase Core Setup for Flutter Web</w:t>
-      </w:r>
-      <w:r>
-        <w:rPr>
-          <w:b/>
-          <w:bCs/>
-          <w:sz w:val="32"/>
-          <w:szCs w:val="32"/>
-        </w:rPr>
-        <w:t>:</w:t>
-      </w:r>
-    </w:p>
-    <w:p>
-      <w:pPr>
-        <w:jc w:val="both"/>
-        <w:rPr>
-          <w:sz w:val="32"/>
-          <w:szCs w:val="32"/>
-        </w:rPr>
-      </w:pPr>
-      <w:r>
-        <w:rPr>
-          <w:sz w:val="32"/>
-          <w:szCs w:val="32"/>
-        </w:rPr>
-        <w:t># VERY IMPORTANT, make sure Web application name is properly changed (which will shown in Firebase console) before setting up Firebase</w:t>
+        <w:t>Firebase Core Setup for Flutter Web:</w:t>
+      </w:r>
+    </w:p>
+    <w:p>
+      <w:pPr>
+        <w:jc w:val="both"/>
+        <w:rPr>
+          <w:sz w:val="32"/>
+          <w:szCs w:val="32"/>
+        </w:rPr>
+      </w:pPr>
+      <w:r>
+        <w:rPr>
+          <w:sz w:val="32"/>
+          <w:szCs w:val="32"/>
+        </w:rPr>
+        <w:t xml:space="preserve"># VERY IMPORTANT, make sure Web application name is properly changed (which will </w:t>
+      </w:r>
+      <w:proofErr w:type="spellStart"/>
+      <w:r>
+        <w:rPr>
+          <w:sz w:val="32"/>
+          <w:szCs w:val="32"/>
+        </w:rPr>
+        <w:t>shown</w:t>
+      </w:r>
+      <w:proofErr w:type="spellEnd"/>
+      <w:r>
+        <w:rPr>
+          <w:sz w:val="32"/>
+          <w:szCs w:val="32"/>
+        </w:rPr>
+        <w:t xml:space="preserve"> in Firebase console) before setting up Firebase</w:t>
       </w:r>
     </w:p>
     <w:p>
@@ -6553,6 +7267,7 @@
         </w:rPr>
         <w:t xml:space="preserve"># Go to the Firebase console and click on add app. And select flutter then copy the </w:t>
       </w:r>
+      <w:proofErr w:type="spellStart"/>
       <w:r>
         <w:rPr>
           <w:b/>
@@ -6562,6 +7277,7 @@
         </w:rPr>
         <w:t>FlutterFire</w:t>
       </w:r>
+      <w:proofErr w:type="spellEnd"/>
       <w:r>
         <w:rPr>
           <w:sz w:val="32"/>
@@ -6581,6 +7297,7 @@
           <w:szCs w:val="32"/>
         </w:rPr>
       </w:pPr>
+      <w:proofErr w:type="spellStart"/>
       <w:r>
         <w:rPr>
           <w:b/>
@@ -6589,8 +7306,9 @@
           <w:sz w:val="32"/>
           <w:szCs w:val="32"/>
         </w:rPr>
-        <w:t>flutterfire configure --project=</w:t>
-      </w:r>
+        <w:t>flutterfire</w:t>
+      </w:r>
+      <w:proofErr w:type="spellEnd"/>
       <w:r>
         <w:rPr>
           <w:b/>
@@ -6599,8 +7317,20 @@
           <w:sz w:val="32"/>
           <w:szCs w:val="32"/>
         </w:rPr>
+        <w:t xml:space="preserve"> configure --project=</w:t>
+      </w:r>
+      <w:proofErr w:type="spellStart"/>
+      <w:r>
+        <w:rPr>
+          <w:b/>
+          <w:bCs/>
+          <w:color w:val="60CAF3" w:themeColor="accent4" w:themeTint="99"/>
+          <w:sz w:val="32"/>
+          <w:szCs w:val="32"/>
+        </w:rPr>
         <w:t>Project_ID</w:t>
       </w:r>
+      <w:proofErr w:type="spellEnd"/>
     </w:p>
     <w:p>
       <w:pPr>
@@ -6692,8 +7422,20 @@
           <w:sz w:val="32"/>
           <w:szCs w:val="32"/>
         </w:rPr>
-        <w:t>flutter pub add firebase_core</w:t>
-      </w:r>
+        <w:t xml:space="preserve">flutter pub add </w:t>
+      </w:r>
+      <w:proofErr w:type="spellStart"/>
+      <w:r>
+        <w:rPr>
+          <w:b/>
+          <w:bCs/>
+          <w:color w:val="60CAF3" w:themeColor="accent4" w:themeTint="99"/>
+          <w:sz w:val="32"/>
+          <w:szCs w:val="32"/>
+        </w:rPr>
+        <w:t>firebase_core</w:t>
+      </w:r>
+      <w:proofErr w:type="spellEnd"/>
     </w:p>
     <w:p>
       <w:pPr>
@@ -6752,7 +7494,29 @@
           <w:sz w:val="32"/>
           <w:szCs w:val="32"/>
         </w:rPr>
-        <w:t xml:space="preserve">     firebase_core: ^4.11.0</w:t>
+        <w:t xml:space="preserve">     </w:t>
+      </w:r>
+      <w:proofErr w:type="spellStart"/>
+      <w:r>
+        <w:rPr>
+          <w:b/>
+          <w:bCs/>
+          <w:color w:val="D86DCB" w:themeColor="accent5" w:themeTint="99"/>
+          <w:sz w:val="32"/>
+          <w:szCs w:val="32"/>
+        </w:rPr>
+        <w:t>firebase_core</w:t>
+      </w:r>
+      <w:proofErr w:type="spellEnd"/>
+      <w:r>
+        <w:rPr>
+          <w:b/>
+          <w:bCs/>
+          <w:color w:val="D86DCB" w:themeColor="accent5" w:themeTint="99"/>
+          <w:sz w:val="32"/>
+          <w:szCs w:val="32"/>
+        </w:rPr>
+        <w:t>: ^4.11.0</w:t>
       </w:r>
     </w:p>
     <w:p>
@@ -6803,6 +7567,8 @@
         </w:rPr>
         <w:t xml:space="preserve">Services) in </w:t>
       </w:r>
+      <w:proofErr w:type="spellStart"/>
+      <w:proofErr w:type="gramStart"/>
       <w:r>
         <w:rPr>
           <w:b/>
@@ -6812,6 +7578,8 @@
         </w:rPr>
         <w:t>main.dart</w:t>
       </w:r>
+      <w:proofErr w:type="spellEnd"/>
+      <w:proofErr w:type="gramEnd"/>
       <w:r>
         <w:rPr>
           <w:sz w:val="32"/>
@@ -6819,14 +7587,25 @@
         </w:rPr>
         <w:t xml:space="preserve"> using </w:t>
       </w:r>
-      <w:r>
-        <w:rPr>
-          <w:b/>
-          <w:bCs/>
-          <w:sz w:val="32"/>
-          <w:szCs w:val="32"/>
-        </w:rPr>
-        <w:t>Firebase.initializeApp(…)</w:t>
+      <w:proofErr w:type="spellStart"/>
+      <w:r>
+        <w:rPr>
+          <w:b/>
+          <w:bCs/>
+          <w:sz w:val="32"/>
+          <w:szCs w:val="32"/>
+        </w:rPr>
+        <w:t>Firebase.initializeApp</w:t>
+      </w:r>
+      <w:proofErr w:type="spellEnd"/>
+      <w:r>
+        <w:rPr>
+          <w:b/>
+          <w:bCs/>
+          <w:sz w:val="32"/>
+          <w:szCs w:val="32"/>
+        </w:rPr>
+        <w:t>(…)</w:t>
       </w:r>
       <w:r>
         <w:rPr>
@@ -6867,14 +7646,25 @@
         </w:rPr>
         <w:t xml:space="preserve"># Make sure to use </w:t>
       </w:r>
-      <w:r>
-        <w:rPr>
-          <w:b/>
-          <w:bCs/>
-          <w:sz w:val="32"/>
-          <w:szCs w:val="32"/>
-        </w:rPr>
-        <w:t>WidgetsFlutterBinding.ensureInitialized()</w:t>
+      <w:proofErr w:type="spellStart"/>
+      <w:r>
+        <w:rPr>
+          <w:b/>
+          <w:bCs/>
+          <w:sz w:val="32"/>
+          <w:szCs w:val="32"/>
+        </w:rPr>
+        <w:t>WidgetsFlutterBinding.ensureInitialized</w:t>
+      </w:r>
+      <w:proofErr w:type="spellEnd"/>
+      <w:r>
+        <w:rPr>
+          <w:b/>
+          <w:bCs/>
+          <w:sz w:val="32"/>
+          <w:szCs w:val="32"/>
+        </w:rPr>
+        <w:t>()</w:t>
       </w:r>
       <w:r>
         <w:rPr>
@@ -6883,14 +7673,25 @@
         </w:rPr>
         <w:t xml:space="preserve"> which is mandatory when </w:t>
       </w:r>
-      <w:r>
-        <w:rPr>
-          <w:b/>
-          <w:bCs/>
-          <w:sz w:val="32"/>
-          <w:szCs w:val="32"/>
-        </w:rPr>
-        <w:t>main()</w:t>
+      <w:proofErr w:type="gramStart"/>
+      <w:r>
+        <w:rPr>
+          <w:b/>
+          <w:bCs/>
+          <w:sz w:val="32"/>
+          <w:szCs w:val="32"/>
+        </w:rPr>
+        <w:t>main(</w:t>
+      </w:r>
+      <w:proofErr w:type="gramEnd"/>
+      <w:r>
+        <w:rPr>
+          <w:b/>
+          <w:bCs/>
+          <w:sz w:val="32"/>
+          <w:szCs w:val="32"/>
+        </w:rPr>
+        <w:t>)</w:t>
       </w:r>
       <w:r>
         <w:rPr>
@@ -6940,6 +7741,7 @@
         </w:rPr>
         <w:t xml:space="preserve"> </w:t>
       </w:r>
+      <w:proofErr w:type="spellStart"/>
       <w:r>
         <w:rPr>
           <w:b/>
@@ -6949,6 +7751,7 @@
         </w:rPr>
         <w:t>DefaultFirebaseOptions.web</w:t>
       </w:r>
+      <w:proofErr w:type="spellEnd"/>
       <w:r>
         <w:rPr>
           <w:sz w:val="32"/>
@@ -7010,7 +7813,29 @@
           <w:sz w:val="32"/>
           <w:szCs w:val="32"/>
         </w:rPr>
-        <w:t>void main() async {</w:t>
+        <w:t xml:space="preserve">void </w:t>
+      </w:r>
+      <w:proofErr w:type="gramStart"/>
+      <w:r>
+        <w:rPr>
+          <w:b/>
+          <w:bCs/>
+          <w:color w:val="D86DCB" w:themeColor="accent5" w:themeTint="99"/>
+          <w:sz w:val="32"/>
+          <w:szCs w:val="32"/>
+        </w:rPr>
+        <w:t>main(</w:t>
+      </w:r>
+      <w:proofErr w:type="gramEnd"/>
+      <w:r>
+        <w:rPr>
+          <w:b/>
+          <w:bCs/>
+          <w:color w:val="D86DCB" w:themeColor="accent5" w:themeTint="99"/>
+          <w:sz w:val="32"/>
+          <w:szCs w:val="32"/>
+        </w:rPr>
+        <w:t>) async {</w:t>
       </w:r>
     </w:p>
     <w:p>
@@ -7054,101 +7879,117 @@
           <w:sz w:val="32"/>
           <w:szCs w:val="32"/>
         </w:rPr>
-        <w:t xml:space="preserve">  WidgetsFlutterBinding.ensureInitialized();</w:t>
-      </w:r>
-    </w:p>
-    <w:p>
-      <w:pPr>
-        <w:jc w:val="both"/>
-        <w:rPr>
-          <w:b/>
-          <w:bCs/>
-          <w:color w:val="D86DCB" w:themeColor="accent5" w:themeTint="99"/>
-          <w:sz w:val="32"/>
-          <w:szCs w:val="32"/>
-        </w:rPr>
-      </w:pPr>
-      <w:r>
-        <w:rPr>
-          <w:b/>
-          <w:bCs/>
-          <w:color w:val="D86DCB" w:themeColor="accent5" w:themeTint="99"/>
-          <w:sz w:val="32"/>
-          <w:szCs w:val="32"/>
-        </w:rPr>
         <w:t xml:space="preserve">  </w:t>
       </w:r>
-      <w:r>
-        <w:rPr>
-          <w:b/>
-          <w:bCs/>
-          <w:color w:val="D86DCB" w:themeColor="accent5" w:themeTint="99"/>
-          <w:sz w:val="32"/>
-          <w:szCs w:val="32"/>
-        </w:rPr>
-        <w:t>a</w:t>
-      </w:r>
-      <w:r>
-        <w:rPr>
-          <w:b/>
-          <w:bCs/>
-          <w:color w:val="D86DCB" w:themeColor="accent5" w:themeTint="99"/>
-          <w:sz w:val="32"/>
-          <w:szCs w:val="32"/>
-        </w:rPr>
-        <w:t>wait</w:t>
-      </w:r>
-      <w:r>
-        <w:rPr>
-          <w:b/>
-          <w:bCs/>
-          <w:color w:val="D86DCB" w:themeColor="accent5" w:themeTint="99"/>
-          <w:sz w:val="32"/>
-          <w:szCs w:val="32"/>
-        </w:rPr>
-        <w:t xml:space="preserve"> </w:t>
-      </w:r>
-      <w:r>
-        <w:rPr>
-          <w:b/>
-          <w:bCs/>
-          <w:color w:val="D86DCB" w:themeColor="accent5" w:themeTint="99"/>
-          <w:sz w:val="32"/>
-          <w:szCs w:val="32"/>
-        </w:rPr>
-        <w:t>Firebase.initializeApp(options: DefaultFirebaseOptions.web);</w:t>
-      </w:r>
-    </w:p>
-    <w:p>
-      <w:pPr>
-        <w:jc w:val="both"/>
-        <w:rPr>
-          <w:b/>
-          <w:bCs/>
-          <w:color w:val="D86DCB" w:themeColor="accent5" w:themeTint="99"/>
-          <w:sz w:val="32"/>
-          <w:szCs w:val="32"/>
-        </w:rPr>
-      </w:pPr>
-      <w:r>
-        <w:rPr>
-          <w:b/>
-          <w:bCs/>
-          <w:color w:val="D86DCB" w:themeColor="accent5" w:themeTint="99"/>
-          <w:sz w:val="32"/>
-          <w:szCs w:val="32"/>
-        </w:rPr>
-        <w:t xml:space="preserve">  </w:t>
-      </w:r>
-      <w:r>
-        <w:rPr>
-          <w:b/>
-          <w:bCs/>
-          <w:color w:val="D86DCB" w:themeColor="accent5" w:themeTint="99"/>
-          <w:sz w:val="32"/>
-          <w:szCs w:val="32"/>
-        </w:rPr>
-        <w:t>…</w:t>
+      <w:proofErr w:type="spellStart"/>
+      <w:r>
+        <w:rPr>
+          <w:b/>
+          <w:bCs/>
+          <w:color w:val="D86DCB" w:themeColor="accent5" w:themeTint="99"/>
+          <w:sz w:val="32"/>
+          <w:szCs w:val="32"/>
+        </w:rPr>
+        <w:t>WidgetsFlutterBinding.ensureInitialized</w:t>
+      </w:r>
+      <w:proofErr w:type="spellEnd"/>
+      <w:r>
+        <w:rPr>
+          <w:b/>
+          <w:bCs/>
+          <w:color w:val="D86DCB" w:themeColor="accent5" w:themeTint="99"/>
+          <w:sz w:val="32"/>
+          <w:szCs w:val="32"/>
+        </w:rPr>
+        <w:t>();</w:t>
+      </w:r>
+    </w:p>
+    <w:p>
+      <w:pPr>
+        <w:jc w:val="both"/>
+        <w:rPr>
+          <w:b/>
+          <w:bCs/>
+          <w:color w:val="D86DCB" w:themeColor="accent5" w:themeTint="99"/>
+          <w:sz w:val="32"/>
+          <w:szCs w:val="32"/>
+        </w:rPr>
+      </w:pPr>
+      <w:r>
+        <w:rPr>
+          <w:b/>
+          <w:bCs/>
+          <w:color w:val="D86DCB" w:themeColor="accent5" w:themeTint="99"/>
+          <w:sz w:val="32"/>
+          <w:szCs w:val="32"/>
+        </w:rPr>
+        <w:t xml:space="preserve">  await </w:t>
+      </w:r>
+      <w:proofErr w:type="spellStart"/>
+      <w:r>
+        <w:rPr>
+          <w:b/>
+          <w:bCs/>
+          <w:color w:val="D86DCB" w:themeColor="accent5" w:themeTint="99"/>
+          <w:sz w:val="32"/>
+          <w:szCs w:val="32"/>
+        </w:rPr>
+        <w:t>Firebase.initializeApp</w:t>
+      </w:r>
+      <w:proofErr w:type="spellEnd"/>
+      <w:r>
+        <w:rPr>
+          <w:b/>
+          <w:bCs/>
+          <w:color w:val="D86DCB" w:themeColor="accent5" w:themeTint="99"/>
+          <w:sz w:val="32"/>
+          <w:szCs w:val="32"/>
+        </w:rPr>
+        <w:t xml:space="preserve">(options: </w:t>
+      </w:r>
+      <w:proofErr w:type="spellStart"/>
+      <w:r>
+        <w:rPr>
+          <w:b/>
+          <w:bCs/>
+          <w:color w:val="D86DCB" w:themeColor="accent5" w:themeTint="99"/>
+          <w:sz w:val="32"/>
+          <w:szCs w:val="32"/>
+        </w:rPr>
+        <w:t>DefaultFirebaseOptions.web</w:t>
+      </w:r>
+      <w:proofErr w:type="spellEnd"/>
+      <w:r>
+        <w:rPr>
+          <w:b/>
+          <w:bCs/>
+          <w:color w:val="D86DCB" w:themeColor="accent5" w:themeTint="99"/>
+          <w:sz w:val="32"/>
+          <w:szCs w:val="32"/>
+        </w:rPr>
+        <w:t>);</w:t>
+      </w:r>
+    </w:p>
+    <w:p>
+      <w:pPr>
+        <w:jc w:val="both"/>
+        <w:rPr>
+          <w:b/>
+          <w:bCs/>
+          <w:color w:val="D86DCB" w:themeColor="accent5" w:themeTint="99"/>
+          <w:sz w:val="32"/>
+          <w:szCs w:val="32"/>
+        </w:rPr>
+      </w:pPr>
+      <w:r>
+        <w:rPr>
+          <w:b/>
+          <w:bCs/>
+          <w:color w:val="D86DCB" w:themeColor="accent5" w:themeTint="99"/>
+          <w:sz w:val="32"/>
+          <w:szCs w:val="32"/>
+        </w:rPr>
+        <w:t xml:space="preserve">  …</w:t>
       </w:r>
     </w:p>
     <w:p>
@@ -7277,6 +8118,7 @@
           <w:szCs w:val="32"/>
         </w:rPr>
       </w:pPr>
+      <w:proofErr w:type="spellStart"/>
       <w:r>
         <w:rPr>
           <w:sz w:val="32"/>
@@ -7284,6 +8126,7 @@
         </w:rPr>
         <w:t>first_open</w:t>
       </w:r>
+      <w:proofErr w:type="spellEnd"/>
     </w:p>
     <w:p>
       <w:pPr>
@@ -7298,6 +8141,7 @@
           <w:szCs w:val="32"/>
         </w:rPr>
       </w:pPr>
+      <w:proofErr w:type="spellStart"/>
       <w:r>
         <w:rPr>
           <w:sz w:val="32"/>
@@ -7305,6 +8149,7 @@
         </w:rPr>
         <w:t>session_start</w:t>
       </w:r>
+      <w:proofErr w:type="spellEnd"/>
     </w:p>
     <w:p>
       <w:pPr>
@@ -7319,6 +8164,7 @@
           <w:szCs w:val="32"/>
         </w:rPr>
       </w:pPr>
+      <w:proofErr w:type="spellStart"/>
       <w:r>
         <w:rPr>
           <w:sz w:val="32"/>
@@ -7326,6 +8172,7 @@
         </w:rPr>
         <w:t>app_update</w:t>
       </w:r>
+      <w:proofErr w:type="spellEnd"/>
     </w:p>
     <w:p>
       <w:pPr>
@@ -7340,6 +8187,7 @@
           <w:szCs w:val="32"/>
         </w:rPr>
       </w:pPr>
+      <w:proofErr w:type="spellStart"/>
       <w:r>
         <w:rPr>
           <w:sz w:val="32"/>
@@ -7347,6 +8195,7 @@
         </w:rPr>
         <w:t>user_engagement</w:t>
       </w:r>
+      <w:proofErr w:type="spellEnd"/>
     </w:p>
     <w:p>
       <w:pPr>
@@ -7486,8 +8335,21 @@
           <w:sz w:val="32"/>
           <w:szCs w:val="32"/>
         </w:rPr>
-        <w:t xml:space="preserve"> main.dart</w:t>
-      </w:r>
+        <w:t xml:space="preserve"> </w:t>
+      </w:r>
+      <w:proofErr w:type="spellStart"/>
+      <w:proofErr w:type="gramStart"/>
+      <w:r>
+        <w:rPr>
+          <w:b/>
+          <w:bCs/>
+          <w:sz w:val="32"/>
+          <w:szCs w:val="32"/>
+        </w:rPr>
+        <w:t>main.dart</w:t>
+      </w:r>
+      <w:proofErr w:type="spellEnd"/>
+      <w:proofErr w:type="gramEnd"/>
     </w:p>
     <w:p>
       <w:pPr>
@@ -7504,6 +8366,7 @@
         </w:rPr>
         <w:t xml:space="preserve"># Then we just simply have to install </w:t>
       </w:r>
+      <w:proofErr w:type="spellStart"/>
       <w:r>
         <w:rPr>
           <w:b/>
@@ -7513,6 +8376,7 @@
         </w:rPr>
         <w:t>firebase_analytics</w:t>
       </w:r>
+      <w:proofErr w:type="spellEnd"/>
       <w:r>
         <w:rPr>
           <w:sz w:val="32"/>
@@ -7540,8 +8404,20 @@
           <w:sz w:val="32"/>
           <w:szCs w:val="32"/>
         </w:rPr>
-        <w:t>flutter pub add firebase_analytics</w:t>
-      </w:r>
+        <w:t xml:space="preserve">flutter pub add </w:t>
+      </w:r>
+      <w:proofErr w:type="spellStart"/>
+      <w:r>
+        <w:rPr>
+          <w:b/>
+          <w:bCs/>
+          <w:color w:val="60CAF3" w:themeColor="accent4" w:themeTint="99"/>
+          <w:sz w:val="32"/>
+          <w:szCs w:val="32"/>
+        </w:rPr>
+        <w:t>firebase_analytics</w:t>
+      </w:r>
+      <w:proofErr w:type="spellEnd"/>
     </w:p>
     <w:p>
       <w:pPr>
@@ -7600,7 +8476,29 @@
           <w:sz w:val="32"/>
           <w:szCs w:val="32"/>
         </w:rPr>
-        <w:t xml:space="preserve">  firebase_analytics: ^12.1.2</w:t>
+        <w:t xml:space="preserve">  </w:t>
+      </w:r>
+      <w:proofErr w:type="spellStart"/>
+      <w:r>
+        <w:rPr>
+          <w:b/>
+          <w:bCs/>
+          <w:color w:val="60CAF3" w:themeColor="accent4" w:themeTint="99"/>
+          <w:sz w:val="32"/>
+          <w:szCs w:val="32"/>
+        </w:rPr>
+        <w:t>firebase_analytics</w:t>
+      </w:r>
+      <w:proofErr w:type="spellEnd"/>
+      <w:r>
+        <w:rPr>
+          <w:b/>
+          <w:bCs/>
+          <w:color w:val="60CAF3" w:themeColor="accent4" w:themeTint="99"/>
+          <w:sz w:val="32"/>
+          <w:szCs w:val="32"/>
+        </w:rPr>
+        <w:t>: ^12.1.2</w:t>
       </w:r>
     </w:p>
     <w:p>
@@ -7634,14 +8532,25 @@
         </w:rPr>
         <w:t xml:space="preserve"># Then run this command (sometimes </w:t>
       </w:r>
-      <w:r>
-        <w:rPr>
-          <w:b/>
-          <w:bCs/>
-          <w:sz w:val="32"/>
-          <w:szCs w:val="32"/>
-        </w:rPr>
-        <w:t xml:space="preserve">FlutterFire </w:t>
+      <w:proofErr w:type="spellStart"/>
+      <w:r>
+        <w:rPr>
+          <w:b/>
+          <w:bCs/>
+          <w:sz w:val="32"/>
+          <w:szCs w:val="32"/>
+        </w:rPr>
+        <w:t>FlutterFire</w:t>
+      </w:r>
+      <w:proofErr w:type="spellEnd"/>
+      <w:r>
+        <w:rPr>
+          <w:b/>
+          <w:bCs/>
+          <w:sz w:val="32"/>
+          <w:szCs w:val="32"/>
+        </w:rPr>
+        <w:t xml:space="preserve"> </w:t>
       </w:r>
       <w:r>
         <w:rPr>
@@ -7659,6 +8568,7 @@
           <w:szCs w:val="32"/>
         </w:rPr>
       </w:pPr>
+      <w:proofErr w:type="spellStart"/>
       <w:r>
         <w:rPr>
           <w:b/>
@@ -7667,7 +8577,18 @@
           <w:sz w:val="32"/>
           <w:szCs w:val="32"/>
         </w:rPr>
-        <w:t>flutterfire configure</w:t>
+        <w:t>flutterfire</w:t>
+      </w:r>
+      <w:proofErr w:type="spellEnd"/>
+      <w:r>
+        <w:rPr>
+          <w:b/>
+          <w:bCs/>
+          <w:color w:val="60CAF3" w:themeColor="accent4" w:themeTint="99"/>
+          <w:sz w:val="32"/>
+          <w:szCs w:val="32"/>
+        </w:rPr>
+        <w:t xml:space="preserve"> configure</w:t>
       </w:r>
     </w:p>
     <w:p>
@@ -7692,8 +8613,79 @@
           <w:sz w:val="32"/>
           <w:szCs w:val="32"/>
         </w:rPr>
-        <w:t xml:space="preserve"> For info see f40 firebase flutter doc</w:t>
-      </w:r>
+        <w:t xml:space="preserve"> For info see f4</w:t>
+      </w:r>
+      <w:r>
+        <w:rPr>
+          <w:sz w:val="32"/>
+          <w:szCs w:val="32"/>
+        </w:rPr>
+        <w:t>3</w:t>
+      </w:r>
+      <w:r>
+        <w:rPr>
+          <w:sz w:val="32"/>
+          <w:szCs w:val="32"/>
+        </w:rPr>
+        <w:t xml:space="preserve"> firebase</w:t>
+      </w:r>
+      <w:r>
+        <w:rPr>
+          <w:sz w:val="32"/>
+          <w:szCs w:val="32"/>
+        </w:rPr>
+        <w:t xml:space="preserve"> Crashlytics and analytics for</w:t>
+      </w:r>
+      <w:r>
+        <w:rPr>
+          <w:sz w:val="32"/>
+          <w:szCs w:val="32"/>
+        </w:rPr>
+        <w:t xml:space="preserve"> flutter doc</w:t>
+      </w:r>
+    </w:p>
+    <w:p>
+      <w:pPr>
+        <w:jc w:val="both"/>
+        <w:rPr>
+          <w:sz w:val="32"/>
+          <w:szCs w:val="32"/>
+        </w:rPr>
+      </w:pPr>
+    </w:p>
+    <w:p>
+      <w:pPr>
+        <w:jc w:val="center"/>
+        <w:rPr>
+          <w:sz w:val="32"/>
+          <w:szCs w:val="32"/>
+        </w:rPr>
+      </w:pPr>
+      <w:r>
+        <w:rPr>
+          <w:sz w:val="32"/>
+          <w:szCs w:val="32"/>
+        </w:rPr>
+        <w:t>Break</w:t>
+      </w:r>
+    </w:p>
+    <w:p>
+      <w:pPr>
+        <w:jc w:val="both"/>
+        <w:rPr>
+          <w:sz w:val="32"/>
+          <w:szCs w:val="32"/>
+        </w:rPr>
+      </w:pPr>
+    </w:p>
+    <w:p>
+      <w:pPr>
+        <w:jc w:val="both"/>
+        <w:rPr>
+          <w:sz w:val="32"/>
+          <w:szCs w:val="32"/>
+        </w:rPr>
+      </w:pPr>
     </w:p>
     <w:p>
       <w:pPr>
@@ -9225,6 +10217,7 @@
   <w:style w:type="character" w:default="1" w:styleId="DefaultParagraphFont">
     <w:name w:val="Default Paragraph Font"/>
     <w:uiPriority w:val="1"/>
+    <w:semiHidden/>
     <w:unhideWhenUsed/>
   </w:style>
   <w:style w:type="table" w:default="1" w:styleId="TableNormal">

</xml_diff>

<commit_message>
Worked on firebase analytics trouble shooting
</commit_message>
<xml_diff>
--- a/flutter_web/fw10_firebase_web_hosting.docx
+++ b/flutter_web/fw10_firebase_web_hosting.docx
@@ -8589,6 +8589,869 @@
           <w:szCs w:val="32"/>
         </w:rPr>
         <w:t xml:space="preserve"> configure</w:t>
+      </w:r>
+    </w:p>
+    <w:p>
+      <w:pPr>
+        <w:jc w:val="both"/>
+        <w:rPr>
+          <w:sz w:val="32"/>
+          <w:szCs w:val="32"/>
+        </w:rPr>
+      </w:pPr>
+    </w:p>
+    <w:p>
+      <w:pPr>
+        <w:jc w:val="both"/>
+        <w:rPr>
+          <w:sz w:val="32"/>
+          <w:szCs w:val="32"/>
+        </w:rPr>
+      </w:pPr>
+      <w:r>
+        <w:rPr>
+          <w:sz w:val="32"/>
+          <w:szCs w:val="32"/>
+        </w:rPr>
+        <w:t>Trouble Shooting Setup of Analytics</w:t>
+      </w:r>
+      <w:r>
+        <w:rPr>
+          <w:sz w:val="32"/>
+          <w:szCs w:val="32"/>
+        </w:rPr>
+        <w:t xml:space="preserve"> (Mandatory for Web)</w:t>
+      </w:r>
+      <w:r>
+        <w:rPr>
+          <w:sz w:val="32"/>
+          <w:szCs w:val="32"/>
+        </w:rPr>
+        <w:t>:</w:t>
+      </w:r>
+    </w:p>
+    <w:p>
+      <w:pPr>
+        <w:jc w:val="both"/>
+        <w:rPr>
+          <w:sz w:val="32"/>
+          <w:szCs w:val="32"/>
+        </w:rPr>
+      </w:pPr>
+      <w:r>
+        <w:rPr>
+          <w:sz w:val="32"/>
+          <w:szCs w:val="32"/>
+        </w:rPr>
+        <w:t xml:space="preserve"># Sometimes </w:t>
+      </w:r>
+      <w:r>
+        <w:rPr>
+          <w:b/>
+          <w:bCs/>
+          <w:sz w:val="32"/>
+          <w:szCs w:val="32"/>
+        </w:rPr>
+        <w:t>Firebase</w:t>
+      </w:r>
+      <w:r>
+        <w:rPr>
+          <w:sz w:val="32"/>
+          <w:szCs w:val="32"/>
+        </w:rPr>
+        <w:t xml:space="preserve"> Google Analytics doesn’t show up the default and automatically collected events like </w:t>
+      </w:r>
+      <w:proofErr w:type="spellStart"/>
+      <w:r>
+        <w:rPr>
+          <w:b/>
+          <w:bCs/>
+          <w:sz w:val="32"/>
+          <w:szCs w:val="32"/>
+        </w:rPr>
+        <w:t>first_open</w:t>
+      </w:r>
+      <w:proofErr w:type="spellEnd"/>
+      <w:r>
+        <w:rPr>
+          <w:sz w:val="32"/>
+          <w:szCs w:val="32"/>
+        </w:rPr>
+        <w:t xml:space="preserve">, </w:t>
+      </w:r>
+      <w:proofErr w:type="spellStart"/>
+      <w:r>
+        <w:rPr>
+          <w:b/>
+          <w:bCs/>
+          <w:sz w:val="32"/>
+          <w:szCs w:val="32"/>
+        </w:rPr>
+        <w:t>page_view</w:t>
+      </w:r>
+      <w:proofErr w:type="spellEnd"/>
+      <w:r>
+        <w:rPr>
+          <w:sz w:val="32"/>
+          <w:szCs w:val="32"/>
+        </w:rPr>
+        <w:t xml:space="preserve">, </w:t>
+      </w:r>
+      <w:r>
+        <w:rPr>
+          <w:b/>
+          <w:bCs/>
+          <w:sz w:val="32"/>
+          <w:szCs w:val="32"/>
+        </w:rPr>
+        <w:t xml:space="preserve">scroll </w:t>
+      </w:r>
+      <w:r>
+        <w:rPr>
+          <w:sz w:val="32"/>
+          <w:szCs w:val="32"/>
+        </w:rPr>
+        <w:t xml:space="preserve">etc. </w:t>
+      </w:r>
+    </w:p>
+    <w:p>
+      <w:pPr>
+        <w:jc w:val="both"/>
+        <w:rPr>
+          <w:sz w:val="32"/>
+          <w:szCs w:val="32"/>
+        </w:rPr>
+      </w:pPr>
+      <w:r>
+        <w:rPr>
+          <w:sz w:val="32"/>
+          <w:szCs w:val="32"/>
+        </w:rPr>
+        <w:t xml:space="preserve"># To enable that go to </w:t>
+      </w:r>
+      <w:r>
+        <w:rPr>
+          <w:b/>
+          <w:bCs/>
+          <w:sz w:val="32"/>
+          <w:szCs w:val="32"/>
+        </w:rPr>
+        <w:t xml:space="preserve">Google Analytics (NOT Firebase console) </w:t>
+      </w:r>
+      <w:r>
+        <w:rPr>
+          <w:b/>
+          <w:bCs/>
+          <w:sz w:val="32"/>
+          <w:szCs w:val="32"/>
+        </w:rPr>
+        <w:sym w:font="Wingdings" w:char="F0E0"/>
+      </w:r>
+      <w:r>
+        <w:rPr>
+          <w:b/>
+          <w:bCs/>
+          <w:sz w:val="32"/>
+          <w:szCs w:val="32"/>
+        </w:rPr>
+        <w:t xml:space="preserve"> admin </w:t>
+      </w:r>
+      <w:r>
+        <w:rPr>
+          <w:b/>
+          <w:bCs/>
+          <w:sz w:val="32"/>
+          <w:szCs w:val="32"/>
+        </w:rPr>
+        <w:sym w:font="Wingdings" w:char="F0E0"/>
+      </w:r>
+      <w:r>
+        <w:rPr>
+          <w:b/>
+          <w:bCs/>
+          <w:sz w:val="32"/>
+          <w:szCs w:val="32"/>
+        </w:rPr>
+        <w:t xml:space="preserve"> Data collection and modification </w:t>
+      </w:r>
+      <w:r>
+        <w:rPr>
+          <w:b/>
+          <w:bCs/>
+          <w:sz w:val="32"/>
+          <w:szCs w:val="32"/>
+        </w:rPr>
+        <w:sym w:font="Wingdings" w:char="F0E0"/>
+      </w:r>
+      <w:r>
+        <w:rPr>
+          <w:b/>
+          <w:bCs/>
+          <w:sz w:val="32"/>
+          <w:szCs w:val="32"/>
+        </w:rPr>
+        <w:t xml:space="preserve"> Data Streams </w:t>
+      </w:r>
+      <w:r>
+        <w:rPr>
+          <w:b/>
+          <w:bCs/>
+          <w:sz w:val="32"/>
+          <w:szCs w:val="32"/>
+        </w:rPr>
+        <w:sym w:font="Wingdings" w:char="F0E0"/>
+      </w:r>
+      <w:r>
+        <w:rPr>
+          <w:b/>
+          <w:bCs/>
+          <w:sz w:val="32"/>
+          <w:szCs w:val="32"/>
+        </w:rPr>
+        <w:t xml:space="preserve"> project (web) </w:t>
+      </w:r>
+      <w:r>
+        <w:rPr>
+          <w:b/>
+          <w:bCs/>
+          <w:sz w:val="32"/>
+          <w:szCs w:val="32"/>
+        </w:rPr>
+        <w:sym w:font="Wingdings" w:char="F0E0"/>
+      </w:r>
+      <w:r>
+        <w:rPr>
+          <w:b/>
+          <w:bCs/>
+          <w:sz w:val="32"/>
+          <w:szCs w:val="32"/>
+        </w:rPr>
+        <w:t xml:space="preserve"> </w:t>
+      </w:r>
+      <w:r>
+        <w:rPr>
+          <w:b/>
+          <w:bCs/>
+          <w:sz w:val="32"/>
+          <w:szCs w:val="32"/>
+        </w:rPr>
+        <w:t>E</w:t>
+      </w:r>
+      <w:r>
+        <w:rPr>
+          <w:b/>
+          <w:bCs/>
+          <w:sz w:val="32"/>
+          <w:szCs w:val="32"/>
+        </w:rPr>
+        <w:t>vent</w:t>
+      </w:r>
+      <w:r>
+        <w:rPr>
+          <w:sz w:val="32"/>
+          <w:szCs w:val="32"/>
+        </w:rPr>
+        <w:t xml:space="preserve"> and finally turn on </w:t>
+      </w:r>
+      <w:r>
+        <w:rPr>
+          <w:b/>
+          <w:bCs/>
+          <w:sz w:val="32"/>
+          <w:szCs w:val="32"/>
+        </w:rPr>
+        <w:t xml:space="preserve">Enhanced Measurement </w:t>
+      </w:r>
+      <w:r>
+        <w:rPr>
+          <w:sz w:val="32"/>
+          <w:szCs w:val="32"/>
+        </w:rPr>
+        <w:t>for default events to show up</w:t>
+      </w:r>
+    </w:p>
+    <w:p>
+      <w:pPr>
+        <w:jc w:val="both"/>
+        <w:rPr>
+          <w:sz w:val="32"/>
+          <w:szCs w:val="32"/>
+        </w:rPr>
+      </w:pPr>
+      <w:r>
+        <w:rPr>
+          <w:sz w:val="32"/>
+          <w:szCs w:val="32"/>
+        </w:rPr>
+        <w:lastRenderedPageBreak/>
+        <w:t xml:space="preserve"># Also, for the first time to establish the connection to Firebase analytics (specially for </w:t>
+      </w:r>
+      <w:r>
+        <w:rPr>
+          <w:b/>
+          <w:bCs/>
+          <w:sz w:val="32"/>
+          <w:szCs w:val="32"/>
+        </w:rPr>
+        <w:t xml:space="preserve">Flutter </w:t>
+      </w:r>
+      <w:r>
+        <w:rPr>
+          <w:sz w:val="32"/>
+          <w:szCs w:val="32"/>
+        </w:rPr>
+        <w:t>Web) we have to send a Custom Log on app start like this. Then remove it later once first connection is done</w:t>
+      </w:r>
+    </w:p>
+    <w:p>
+      <w:pPr>
+        <w:jc w:val="both"/>
+        <w:rPr>
+          <w:color w:val="D86DCB" w:themeColor="accent5" w:themeTint="99"/>
+          <w:sz w:val="32"/>
+          <w:szCs w:val="32"/>
+        </w:rPr>
+      </w:pPr>
+      <w:r>
+        <w:rPr>
+          <w:sz w:val="32"/>
+          <w:szCs w:val="32"/>
+        </w:rPr>
+        <w:t xml:space="preserve"># Then we’ll see the events and other info in </w:t>
+      </w:r>
+      <w:r>
+        <w:rPr>
+          <w:b/>
+          <w:bCs/>
+          <w:sz w:val="32"/>
+          <w:szCs w:val="32"/>
+        </w:rPr>
+        <w:t>Real-time Analytics</w:t>
+      </w:r>
+      <w:r>
+        <w:rPr>
+          <w:sz w:val="32"/>
+          <w:szCs w:val="32"/>
+        </w:rPr>
+        <w:t xml:space="preserve"> Fir</w:t>
+      </w:r>
+      <w:r>
+        <w:rPr>
+          <w:sz w:val="32"/>
+          <w:szCs w:val="32"/>
+        </w:rPr>
+        <w:t xml:space="preserve">st and then Analytics Dashboard or </w:t>
+      </w:r>
+      <w:proofErr w:type="spellStart"/>
+      <w:r>
+        <w:rPr>
+          <w:b/>
+          <w:bCs/>
+          <w:sz w:val="32"/>
+          <w:szCs w:val="32"/>
+        </w:rPr>
+        <w:t>DebugView</w:t>
+      </w:r>
+      <w:proofErr w:type="spellEnd"/>
+    </w:p>
+    <w:p>
+      <w:pPr>
+        <w:jc w:val="both"/>
+        <w:rPr>
+          <w:b/>
+          <w:bCs/>
+          <w:color w:val="D86DCB" w:themeColor="accent5" w:themeTint="99"/>
+          <w:sz w:val="32"/>
+          <w:szCs w:val="32"/>
+        </w:rPr>
+      </w:pPr>
+      <w:r>
+        <w:rPr>
+          <w:b/>
+          <w:bCs/>
+          <w:color w:val="D86DCB" w:themeColor="accent5" w:themeTint="99"/>
+          <w:sz w:val="32"/>
+          <w:szCs w:val="32"/>
+        </w:rPr>
+        <w:t xml:space="preserve">void </w:t>
+      </w:r>
+      <w:proofErr w:type="gramStart"/>
+      <w:r>
+        <w:rPr>
+          <w:b/>
+          <w:bCs/>
+          <w:color w:val="D86DCB" w:themeColor="accent5" w:themeTint="99"/>
+          <w:sz w:val="32"/>
+          <w:szCs w:val="32"/>
+        </w:rPr>
+        <w:t>main(</w:t>
+      </w:r>
+      <w:proofErr w:type="gramEnd"/>
+      <w:r>
+        <w:rPr>
+          <w:b/>
+          <w:bCs/>
+          <w:color w:val="D86DCB" w:themeColor="accent5" w:themeTint="99"/>
+          <w:sz w:val="32"/>
+          <w:szCs w:val="32"/>
+        </w:rPr>
+        <w:t>) async {</w:t>
+      </w:r>
+    </w:p>
+    <w:p>
+      <w:pPr>
+        <w:jc w:val="both"/>
+        <w:rPr>
+          <w:b/>
+          <w:bCs/>
+          <w:color w:val="D86DCB" w:themeColor="accent5" w:themeTint="99"/>
+          <w:sz w:val="32"/>
+          <w:szCs w:val="32"/>
+        </w:rPr>
+      </w:pPr>
+      <w:r>
+        <w:rPr>
+          <w:b/>
+          <w:bCs/>
+          <w:color w:val="D86DCB" w:themeColor="accent5" w:themeTint="99"/>
+          <w:sz w:val="32"/>
+          <w:szCs w:val="32"/>
+        </w:rPr>
+        <w:t xml:space="preserve">  // Make sure Flutter binding is initialized</w:t>
+      </w:r>
+    </w:p>
+    <w:p>
+      <w:pPr>
+        <w:jc w:val="both"/>
+        <w:rPr>
+          <w:b/>
+          <w:bCs/>
+          <w:color w:val="D86DCB" w:themeColor="accent5" w:themeTint="99"/>
+          <w:sz w:val="32"/>
+          <w:szCs w:val="32"/>
+        </w:rPr>
+      </w:pPr>
+      <w:r>
+        <w:rPr>
+          <w:b/>
+          <w:bCs/>
+          <w:color w:val="D86DCB" w:themeColor="accent5" w:themeTint="99"/>
+          <w:sz w:val="32"/>
+          <w:szCs w:val="32"/>
+        </w:rPr>
+        <w:t xml:space="preserve">  </w:t>
+      </w:r>
+      <w:proofErr w:type="spellStart"/>
+      <w:r>
+        <w:rPr>
+          <w:b/>
+          <w:bCs/>
+          <w:color w:val="D86DCB" w:themeColor="accent5" w:themeTint="99"/>
+          <w:sz w:val="32"/>
+          <w:szCs w:val="32"/>
+        </w:rPr>
+        <w:t>WidgetsFlutterBinding.ensureInitialized</w:t>
+      </w:r>
+      <w:proofErr w:type="spellEnd"/>
+      <w:r>
+        <w:rPr>
+          <w:b/>
+          <w:bCs/>
+          <w:color w:val="D86DCB" w:themeColor="accent5" w:themeTint="99"/>
+          <w:sz w:val="32"/>
+          <w:szCs w:val="32"/>
+        </w:rPr>
+        <w:t>();</w:t>
+      </w:r>
+    </w:p>
+    <w:p>
+      <w:pPr>
+        <w:jc w:val="both"/>
+        <w:rPr>
+          <w:b/>
+          <w:bCs/>
+          <w:color w:val="D86DCB" w:themeColor="accent5" w:themeTint="99"/>
+          <w:sz w:val="32"/>
+          <w:szCs w:val="32"/>
+        </w:rPr>
+      </w:pPr>
+      <w:r>
+        <w:rPr>
+          <w:b/>
+          <w:bCs/>
+          <w:color w:val="D86DCB" w:themeColor="accent5" w:themeTint="99"/>
+          <w:sz w:val="32"/>
+          <w:szCs w:val="32"/>
+        </w:rPr>
+        <w:t xml:space="preserve">  await </w:t>
+      </w:r>
+      <w:proofErr w:type="spellStart"/>
+      <w:r>
+        <w:rPr>
+          <w:b/>
+          <w:bCs/>
+          <w:color w:val="D86DCB" w:themeColor="accent5" w:themeTint="99"/>
+          <w:sz w:val="32"/>
+          <w:szCs w:val="32"/>
+        </w:rPr>
+        <w:t>Firebase.initializeApp</w:t>
+      </w:r>
+      <w:proofErr w:type="spellEnd"/>
+      <w:r>
+        <w:rPr>
+          <w:b/>
+          <w:bCs/>
+          <w:color w:val="D86DCB" w:themeColor="accent5" w:themeTint="99"/>
+          <w:sz w:val="32"/>
+          <w:szCs w:val="32"/>
+        </w:rPr>
+        <w:t xml:space="preserve">(options: </w:t>
+      </w:r>
+      <w:proofErr w:type="spellStart"/>
+      <w:r>
+        <w:rPr>
+          <w:b/>
+          <w:bCs/>
+          <w:color w:val="D86DCB" w:themeColor="accent5" w:themeTint="99"/>
+          <w:sz w:val="32"/>
+          <w:szCs w:val="32"/>
+        </w:rPr>
+        <w:t>DefaultFirebaseOptions.web</w:t>
+      </w:r>
+      <w:proofErr w:type="spellEnd"/>
+      <w:r>
+        <w:rPr>
+          <w:b/>
+          <w:bCs/>
+          <w:color w:val="D86DCB" w:themeColor="accent5" w:themeTint="99"/>
+          <w:sz w:val="32"/>
+          <w:szCs w:val="32"/>
+        </w:rPr>
+        <w:t>);</w:t>
+      </w:r>
+    </w:p>
+    <w:p>
+      <w:pPr>
+        <w:jc w:val="both"/>
+        <w:rPr>
+          <w:b/>
+          <w:bCs/>
+          <w:color w:val="D86DCB" w:themeColor="accent5" w:themeTint="99"/>
+          <w:sz w:val="32"/>
+          <w:szCs w:val="32"/>
+        </w:rPr>
+      </w:pPr>
+      <w:r>
+        <w:rPr>
+          <w:b/>
+          <w:bCs/>
+          <w:color w:val="D86DCB" w:themeColor="accent5" w:themeTint="99"/>
+          <w:sz w:val="32"/>
+          <w:szCs w:val="32"/>
+        </w:rPr>
+        <w:t xml:space="preserve">  final analytics = </w:t>
+      </w:r>
+      <w:proofErr w:type="spellStart"/>
+      <w:r>
+        <w:rPr>
+          <w:b/>
+          <w:bCs/>
+          <w:color w:val="D86DCB" w:themeColor="accent5" w:themeTint="99"/>
+          <w:sz w:val="32"/>
+          <w:szCs w:val="32"/>
+        </w:rPr>
+        <w:t>FirebaseAnalytics.instance</w:t>
+      </w:r>
+      <w:proofErr w:type="spellEnd"/>
+      <w:r>
+        <w:rPr>
+          <w:b/>
+          <w:bCs/>
+          <w:color w:val="D86DCB" w:themeColor="accent5" w:themeTint="99"/>
+          <w:sz w:val="32"/>
+          <w:szCs w:val="32"/>
+        </w:rPr>
+        <w:t>;</w:t>
+      </w:r>
+    </w:p>
+    <w:p>
+      <w:pPr>
+        <w:jc w:val="both"/>
+        <w:rPr>
+          <w:b/>
+          <w:bCs/>
+          <w:color w:val="D86DCB" w:themeColor="accent5" w:themeTint="99"/>
+          <w:sz w:val="32"/>
+          <w:szCs w:val="32"/>
+        </w:rPr>
+      </w:pPr>
+      <w:r>
+        <w:rPr>
+          <w:b/>
+          <w:bCs/>
+          <w:color w:val="D86DCB" w:themeColor="accent5" w:themeTint="99"/>
+          <w:sz w:val="32"/>
+          <w:szCs w:val="32"/>
+        </w:rPr>
+        <w:t xml:space="preserve">  await </w:t>
+      </w:r>
+      <w:proofErr w:type="spellStart"/>
+      <w:proofErr w:type="gramStart"/>
+      <w:r>
+        <w:rPr>
+          <w:b/>
+          <w:bCs/>
+          <w:color w:val="D86DCB" w:themeColor="accent5" w:themeTint="99"/>
+          <w:sz w:val="32"/>
+          <w:szCs w:val="32"/>
+        </w:rPr>
+        <w:t>analytics.setAnalyticsCollectionEnabled</w:t>
+      </w:r>
+      <w:proofErr w:type="spellEnd"/>
+      <w:proofErr w:type="gramEnd"/>
+      <w:r>
+        <w:rPr>
+          <w:b/>
+          <w:bCs/>
+          <w:color w:val="D86DCB" w:themeColor="accent5" w:themeTint="99"/>
+          <w:sz w:val="32"/>
+          <w:szCs w:val="32"/>
+        </w:rPr>
+        <w:t>(true);</w:t>
+      </w:r>
+    </w:p>
+    <w:p>
+      <w:pPr>
+        <w:jc w:val="both"/>
+        <w:rPr>
+          <w:b/>
+          <w:bCs/>
+          <w:color w:val="D86DCB" w:themeColor="accent5" w:themeTint="99"/>
+          <w:sz w:val="32"/>
+          <w:szCs w:val="32"/>
+        </w:rPr>
+      </w:pPr>
+      <w:r>
+        <w:rPr>
+          <w:b/>
+          <w:bCs/>
+          <w:color w:val="D86DCB" w:themeColor="accent5" w:themeTint="99"/>
+          <w:sz w:val="32"/>
+          <w:szCs w:val="32"/>
+        </w:rPr>
+        <w:t xml:space="preserve">  await </w:t>
+      </w:r>
+      <w:proofErr w:type="spellStart"/>
+      <w:proofErr w:type="gramStart"/>
+      <w:r>
+        <w:rPr>
+          <w:b/>
+          <w:bCs/>
+          <w:color w:val="D86DCB" w:themeColor="accent5" w:themeTint="99"/>
+          <w:sz w:val="32"/>
+          <w:szCs w:val="32"/>
+        </w:rPr>
+        <w:t>analytics.logEvent</w:t>
+      </w:r>
+      <w:proofErr w:type="spellEnd"/>
+      <w:proofErr w:type="gramEnd"/>
+      <w:r>
+        <w:rPr>
+          <w:b/>
+          <w:bCs/>
+          <w:color w:val="D86DCB" w:themeColor="accent5" w:themeTint="99"/>
+          <w:sz w:val="32"/>
+          <w:szCs w:val="32"/>
+        </w:rPr>
+        <w:t>(</w:t>
+      </w:r>
+    </w:p>
+    <w:p>
+      <w:pPr>
+        <w:jc w:val="both"/>
+        <w:rPr>
+          <w:b/>
+          <w:bCs/>
+          <w:color w:val="D86DCB" w:themeColor="accent5" w:themeTint="99"/>
+          <w:sz w:val="32"/>
+          <w:szCs w:val="32"/>
+        </w:rPr>
+      </w:pPr>
+      <w:r>
+        <w:rPr>
+          <w:b/>
+          <w:bCs/>
+          <w:color w:val="D86DCB" w:themeColor="accent5" w:themeTint="99"/>
+          <w:sz w:val="32"/>
+          <w:szCs w:val="32"/>
+        </w:rPr>
+        <w:t xml:space="preserve">    name: '</w:t>
+      </w:r>
+      <w:proofErr w:type="spellStart"/>
+      <w:r>
+        <w:rPr>
+          <w:b/>
+          <w:bCs/>
+          <w:color w:val="D86DCB" w:themeColor="accent5" w:themeTint="99"/>
+          <w:sz w:val="32"/>
+          <w:szCs w:val="32"/>
+        </w:rPr>
+        <w:t>startup_test</w:t>
+      </w:r>
+      <w:proofErr w:type="spellEnd"/>
+      <w:r>
+        <w:rPr>
+          <w:b/>
+          <w:bCs/>
+          <w:color w:val="D86DCB" w:themeColor="accent5" w:themeTint="99"/>
+          <w:sz w:val="32"/>
+          <w:szCs w:val="32"/>
+        </w:rPr>
+        <w:t>',</w:t>
+      </w:r>
+    </w:p>
+    <w:p>
+      <w:pPr>
+        <w:jc w:val="both"/>
+        <w:rPr>
+          <w:b/>
+          <w:bCs/>
+          <w:color w:val="D86DCB" w:themeColor="accent5" w:themeTint="99"/>
+          <w:sz w:val="32"/>
+          <w:szCs w:val="32"/>
+        </w:rPr>
+      </w:pPr>
+      <w:r>
+        <w:rPr>
+          <w:b/>
+          <w:bCs/>
+          <w:color w:val="D86DCB" w:themeColor="accent5" w:themeTint="99"/>
+          <w:sz w:val="32"/>
+          <w:szCs w:val="32"/>
+        </w:rPr>
+        <w:t xml:space="preserve">  );</w:t>
+      </w:r>
+    </w:p>
+    <w:p>
+      <w:pPr>
+        <w:jc w:val="both"/>
+        <w:rPr>
+          <w:b/>
+          <w:bCs/>
+          <w:color w:val="D86DCB" w:themeColor="accent5" w:themeTint="99"/>
+          <w:sz w:val="32"/>
+          <w:szCs w:val="32"/>
+        </w:rPr>
+      </w:pPr>
+      <w:r>
+        <w:rPr>
+          <w:b/>
+          <w:bCs/>
+          <w:color w:val="D86DCB" w:themeColor="accent5" w:themeTint="99"/>
+          <w:sz w:val="32"/>
+          <w:szCs w:val="32"/>
+        </w:rPr>
+        <w:t xml:space="preserve">  …</w:t>
+      </w:r>
+    </w:p>
+    <w:p>
+      <w:pPr>
+        <w:jc w:val="both"/>
+        <w:rPr>
+          <w:b/>
+          <w:bCs/>
+          <w:color w:val="D86DCB" w:themeColor="accent5" w:themeTint="99"/>
+          <w:sz w:val="32"/>
+          <w:szCs w:val="32"/>
+        </w:rPr>
+      </w:pPr>
+      <w:r>
+        <w:rPr>
+          <w:b/>
+          <w:bCs/>
+          <w:color w:val="D86DCB" w:themeColor="accent5" w:themeTint="99"/>
+          <w:sz w:val="32"/>
+          <w:szCs w:val="32"/>
+        </w:rPr>
+        <w:t xml:space="preserve">  </w:t>
+      </w:r>
+      <w:proofErr w:type="spellStart"/>
+      <w:proofErr w:type="gramStart"/>
+      <w:r>
+        <w:rPr>
+          <w:b/>
+          <w:bCs/>
+          <w:color w:val="D86DCB" w:themeColor="accent5" w:themeTint="99"/>
+          <w:sz w:val="32"/>
+          <w:szCs w:val="32"/>
+        </w:rPr>
+        <w:t>runApp</w:t>
+      </w:r>
+      <w:proofErr w:type="spellEnd"/>
+      <w:r>
+        <w:rPr>
+          <w:b/>
+          <w:bCs/>
+          <w:color w:val="D86DCB" w:themeColor="accent5" w:themeTint="99"/>
+          <w:sz w:val="32"/>
+          <w:szCs w:val="32"/>
+        </w:rPr>
+        <w:t>(</w:t>
+      </w:r>
+      <w:proofErr w:type="gramEnd"/>
+      <w:r>
+        <w:rPr>
+          <w:b/>
+          <w:bCs/>
+          <w:color w:val="D86DCB" w:themeColor="accent5" w:themeTint="99"/>
+          <w:sz w:val="32"/>
+          <w:szCs w:val="32"/>
+        </w:rPr>
+        <w:t xml:space="preserve">const </w:t>
+      </w:r>
+      <w:proofErr w:type="spellStart"/>
+      <w:r>
+        <w:rPr>
+          <w:b/>
+          <w:bCs/>
+          <w:color w:val="D86DCB" w:themeColor="accent5" w:themeTint="99"/>
+          <w:sz w:val="32"/>
+          <w:szCs w:val="32"/>
+        </w:rPr>
+        <w:t>MyApp</w:t>
+      </w:r>
+      <w:proofErr w:type="spellEnd"/>
+      <w:r>
+        <w:rPr>
+          <w:b/>
+          <w:bCs/>
+          <w:color w:val="D86DCB" w:themeColor="accent5" w:themeTint="99"/>
+          <w:sz w:val="32"/>
+          <w:szCs w:val="32"/>
+        </w:rPr>
+        <w:t>());</w:t>
+      </w:r>
+    </w:p>
+    <w:p>
+      <w:pPr>
+        <w:jc w:val="both"/>
+        <w:rPr>
+          <w:b/>
+          <w:bCs/>
+          <w:color w:val="D86DCB" w:themeColor="accent5" w:themeTint="99"/>
+          <w:sz w:val="32"/>
+          <w:szCs w:val="32"/>
+        </w:rPr>
+      </w:pPr>
+      <w:r>
+        <w:rPr>
+          <w:b/>
+          <w:bCs/>
+          <w:color w:val="D86DCB" w:themeColor="accent5" w:themeTint="99"/>
+          <w:sz w:val="32"/>
+          <w:szCs w:val="32"/>
+        </w:rPr>
+        <w:t>}</w:t>
       </w:r>
     </w:p>
     <w:p>

</xml_diff>